<commit_message>
Add header (name/LinkedIn/GitHub), footer (page X of Y), and CONFIDENTIAL watermark to all docx exports
Updated reference-compact.docx with header bar, page numbering, and
diagonal watermark. Re-exported master, AWS, and Palantir resumes.

Co-Authored-By: Claude Opus 4.6 (1M context) <noreply@anthropic.com>
</commit_message>
<xml_diff>
--- a/outputs/2026-03-23-aws-platform/Vamshi_Resume_2026_AWS.docx
+++ b/outputs/2026-03-23-aws-platform/Vamshi_Resume_2026_AWS.docx
@@ -2,7 +2,7 @@
 <file path=word/document.xml><?xml version="1.0" encoding="utf-8"?>
 <w:document xmlns:w="http://schemas.openxmlformats.org/wordprocessingml/2006/main" xmlns:m="http://schemas.openxmlformats.org/officeDocument/2006/math" xmlns:r="http://schemas.openxmlformats.org/officeDocument/2006/relationships" xmlns:o="urn:schemas-microsoft-com:office:office" xmlns:v="urn:schemas-microsoft-com:vml" xmlns:w10="urn:schemas-microsoft-com:office:word" xmlns:a="http://schemas.openxmlformats.org/drawingml/2006/main" xmlns:pic="http://schemas.openxmlformats.org/drawingml/2006/picture" xmlns:wp="http://schemas.openxmlformats.org/drawingml/2006/wordprocessingDrawing">
   <w:body>
-    <w:bookmarkStart w:id="12" w:name="vamshi-singam"/>
+    <w:bookmarkStart w:id="22" w:name="vamshi-singam"/>
     <w:p>
       <w:pPr>
         <w:pStyle w:val="Heading1"/>
@@ -43,7 +43,7 @@
       <w:r>
         <w:t xml:space="preserve"> </w:t>
       </w:r>
-      <w:hyperlink r:id="rId9">
+      <w:hyperlink r:id="rId19">
         <w:r>
           <w:rPr>
             <w:rStyle w:val="Hyperlink"/>
@@ -60,7 +60,7 @@
       <w:r>
         <w:t xml:space="preserve"> </w:t>
       </w:r>
-      <w:hyperlink r:id="rId10">
+      <w:hyperlink r:id="rId20">
         <w:r>
           <w:rPr>
             <w:rStyle w:val="Hyperlink"/>
@@ -77,7 +77,7 @@
       <w:r>
         <w:t xml:space="preserve"> </w:t>
       </w:r>
-      <w:hyperlink r:id="rId11">
+      <w:hyperlink r:id="rId21">
         <w:r>
           <w:rPr>
             <w:rStyle w:val="Hyperlink"/>
@@ -6197,8 +6197,10 @@
         <w:t xml:space="preserve">ASP.NET, VB.NET, SQL Server, HTML, CSS</w:t>
       </w:r>
     </w:p>
-    <w:bookmarkEnd w:id="12"/>
+    <w:bookmarkEnd w:id="22"/>
     <w:sectPr>
+      <w:headerReference r:id="rId9" w:type="default"/>
+      <w:footerReference r:id="rId10" w:type="default"/>
       <w:pgSz w:h="15840" w:w="12240"/>
       <w:pgMar w:bottom="576" w:footer="720" w:gutter="0" w:header="720" w:left="720" w:right="720" w:top="576"/>
       <w:cols w:space="720"/>
@@ -6212,6 +6214,55 @@
 <w:comments xmlns:w="http://schemas.openxmlformats.org/wordprocessingml/2006/main" xmlns:m="http://schemas.openxmlformats.org/officeDocument/2006/math" xmlns:r="http://schemas.openxmlformats.org/officeDocument/2006/relationships" xmlns:o="urn:schemas-microsoft-com:office:office" xmlns:v="urn:schemas-microsoft-com:vml" xmlns:w10="urn:schemas-microsoft-com:office:word" xmlns:a="http://schemas.openxmlformats.org/drawingml/2006/main" xmlns:pic="http://schemas.openxmlformats.org/drawingml/2006/picture" xmlns:wp="http://schemas.openxmlformats.org/drawingml/2006/wordprocessingDrawing"/>
 </file>
 
+<file path=word/footer1.xml><?xml version="1.0" encoding="utf-8"?>
+<w:ftr xmlns:m="http://schemas.openxmlformats.org/officeDocument/2006/math" xmlns:mc="http://schemas.openxmlformats.org/markup-compatibility/2006" xmlns:mo="http://schemas.microsoft.com/office/mac/office/2008/main" xmlns:mv="urn:schemas-microsoft-com:mac:vml" xmlns:o="urn:schemas-microsoft-com:office:office" xmlns:r="http://schemas.openxmlformats.org/officeDocument/2006/relationships" xmlns:v="urn:schemas-microsoft-com:vml" xmlns:w10="urn:schemas-microsoft-com:office:word" xmlns:w14="http://schemas.microsoft.com/office/word/2010/wordml" xmlns:w="http://schemas.openxmlformats.org/wordprocessingml/2006/main" xmlns:wne="http://schemas.microsoft.com/office/word/2006/wordml" xmlns:wp14="http://schemas.microsoft.com/office/word/2010/wordprocessingDrawing" xmlns:wp="http://schemas.openxmlformats.org/drawingml/2006/wordprocessingDrawing" xmlns:wpc="http://schemas.microsoft.com/office/word/2010/wordprocessingCanvas" xmlns:wpg="http://schemas.microsoft.com/office/word/2010/wordprocessingGroup" xmlns:wpi="http://schemas.microsoft.com/office/word/2010/wordprocessingInk" xmlns:wps="http://schemas.microsoft.com/office/word/2010/wordprocessingShape" mc:Ignorable="w14 wp14">
+  <w:p>
+    <w:pPr>
+      <w:pStyle w:val="Footer"/>
+      <w:spacing w:before="80" w:after="0"/>
+      <w:jc w:val="center"/>
+      <w:pBdr>
+        <w:top w:val="single" w:sz="4" w:space="1" w:color="CCCCCC"/>
+      </w:pBdr>
+    </w:pPr>
+    <w:r>
+      <w:rPr>
+        <w:color w:val="666666"/>
+        <w:sz w:val="15"/>
+      </w:rPr>
+      <w:t xml:space="preserve">Page </w:t>
+    </w:r>
+    <w:r>
+      <w:rPr>
+        <w:color w:val="666666"/>
+        <w:sz w:val="15"/>
+      </w:rPr>
+      <w:fldChar w:fldCharType="begin"/>
+      <w:instrText xml:space="preserve"> PAGE </w:instrText>
+      <w:fldChar w:fldCharType="separate"/>
+      <w:fldChar w:fldCharType="end"/>
+    </w:r>
+    <w:r>
+      <w:rPr>
+        <w:color w:val="666666"/>
+        <w:sz w:val="15"/>
+      </w:rPr>
+      <w:t xml:space="preserve"> of </w:t>
+    </w:r>
+    <w:r>
+      <w:rPr>
+        <w:color w:val="666666"/>
+        <w:sz w:val="15"/>
+      </w:rPr>
+      <w:fldChar w:fldCharType="begin"/>
+      <w:instrText xml:space="preserve"> NUMPAGES </w:instrText>
+      <w:fldChar w:fldCharType="separate"/>
+      <w:fldChar w:fldCharType="end"/>
+    </w:r>
+  </w:p>
+</w:ftr>
+</file>
+
 <file path=word/footnotes.xml><?xml version="1.0" encoding="utf-8"?>
 <w:footnotes xmlns:w="http://schemas.openxmlformats.org/wordprocessingml/2006/main" xmlns:m="http://schemas.openxmlformats.org/officeDocument/2006/math" xmlns:r="http://schemas.openxmlformats.org/officeDocument/2006/relationships" xmlns:o="urn:schemas-microsoft-com:office:office" xmlns:v="urn:schemas-microsoft-com:vml" xmlns:w10="urn:schemas-microsoft-com:office:word" xmlns:a="http://schemas.openxmlformats.org/drawingml/2006/main" xmlns:pic="http://schemas.openxmlformats.org/drawingml/2006/picture" xmlns:wp="http://schemas.openxmlformats.org/drawingml/2006/wordprocessingDrawing">
   <w:footnote w:type="continuationSeparator" w:id="0">
@@ -6229,6 +6280,92 @@
     </w:p>
   </w:footnote>
 </w:footnotes>
+</file>
+
+<file path=word/header1.xml><?xml version="1.0" encoding="utf-8"?>
+<w:hdr xmlns:m="http://schemas.openxmlformats.org/officeDocument/2006/math" xmlns:mc="http://schemas.openxmlformats.org/markup-compatibility/2006" xmlns:mo="http://schemas.microsoft.com/office/mac/office/2008/main" xmlns:mv="urn:schemas-microsoft-com:mac:vml" xmlns:o="urn:schemas-microsoft-com:office:office" xmlns:r="http://schemas.openxmlformats.org/officeDocument/2006/relationships" xmlns:v="urn:schemas-microsoft-com:vml" xmlns:w10="urn:schemas-microsoft-com:office:word" xmlns:w14="http://schemas.microsoft.com/office/word/2010/wordml" xmlns:w="http://schemas.openxmlformats.org/wordprocessingml/2006/main" xmlns:wne="http://schemas.microsoft.com/office/word/2006/wordml" xmlns:wp14="http://schemas.microsoft.com/office/word/2010/wordprocessingDrawing" xmlns:wp="http://schemas.openxmlformats.org/drawingml/2006/wordprocessingDrawing" xmlns:wpc="http://schemas.microsoft.com/office/word/2010/wordprocessingCanvas" xmlns:wpg="http://schemas.microsoft.com/office/word/2010/wordprocessingGroup" xmlns:wpi="http://schemas.microsoft.com/office/word/2010/wordprocessingInk" xmlns:wps="http://schemas.microsoft.com/office/word/2010/wordprocessingShape" mc:Ignorable="w14 wp14">
+  <w:p>
+    <w:pPr>
+      <w:pStyle w:val="Header"/>
+      <w:spacing w:after="40" w:before="0"/>
+      <w:jc w:val="center"/>
+      <w:pBdr>
+        <w:bottom w:val="single" w:sz="4" w:space="1" w:color="CCCCCC"/>
+      </w:pBdr>
+    </w:pPr>
+    <w:r>
+      <w:rPr>
+        <w:b/>
+        <w:color w:val="333333"/>
+        <w:sz w:val="16"/>
+      </w:rPr>
+      <w:t>Vamshi Singam</w:t>
+    </w:r>
+    <w:r>
+      <w:rPr>
+        <w:color w:val="999999"/>
+        <w:sz w:val="16"/>
+      </w:rPr>
+      <w:t xml:space="preserve">  |  </w:t>
+    </w:r>
+    <w:r>
+      <w:rPr>
+        <w:color w:val="0077B5"/>
+        <w:sz w:val="15"/>
+      </w:rPr>
+      <w:t>linkedin.com/in/vamshi-singam-82963556</w:t>
+    </w:r>
+    <w:r>
+      <w:rPr>
+        <w:color w:val="999999"/>
+        <w:sz w:val="16"/>
+      </w:rPr>
+      <w:t xml:space="preserve">  |  </w:t>
+    </w:r>
+    <w:r>
+      <w:rPr>
+        <w:color w:val="333333"/>
+        <w:sz w:val="15"/>
+      </w:rPr>
+      <w:t>github.com/vamshi455</w:t>
+    </w:r>
+    <w:r>
+      <w:rPr>
+        <w:noProof/>
+      </w:rPr>
+      <w:pict>
+        <v:shapetype id="_x0000_t136" coordsize="21600,21600" o:spt="136" adj="10800" path="m@7,l@8,m@5,21600l@6,21600e">
+          <v:formulas>
+            <v:f eqn="sum #0 0 10800"/>
+            <v:f eqn="prod #0 2 1"/>
+            <v:f eqn="sum 21600 0 @1"/>
+            <v:f eqn="sum 0 0 @2"/>
+            <v:f eqn="sum 21600 0 @3"/>
+            <v:f eqn="if @0 @3 0"/>
+            <v:f eqn="if @0 21600 @1"/>
+            <v:f eqn="if @0 0 @2"/>
+            <v:f eqn="if @0 @4 21600"/>
+            <v:f eqn="mid @5 @6"/>
+            <v:f eqn="mid @8 @5"/>
+            <v:f eqn="mid @7 @8"/>
+            <v:f eqn="mid @6 @7"/>
+            <v:f eqn="sum @6 0 @5"/>
+          </v:formulas>
+          <v:path textpathok="t" o:connecttype="custom" o:connectlocs="@9,0;@10,10800;@11,21600;@12,10800" o:connectangles="270,180,90,0"/>
+          <v:textpath on="t" fitshape="t"/>
+          <v:handles>
+            <v:h position="#0,bottomRight" xrange="6629,14971"/>
+          </v:handles>
+          <o:lock v:ext="edit" text="t" shapetype="t"/>
+        </v:shapetype>
+        <v:shape id="PowerPlusWaterMarkObject" o:spid="_x0000_s2049" type="#_x0000_t136" style="position:absolute;margin-left:0;margin-top:0;      width:500pt;height:100pt;rotation:315;      z-index:-251658752;mso-position-horizontal:center;      mso-position-horizontal-relative:margin;      mso-position-vertical:center;      mso-position-vertical-relative:margin" o:allowincell="f" fillcolor="#F0F0F0" stroked="f">
+          <v:fill opacity=".15"/>
+          <v:textpath style="font-family:&quot;Calibri&quot;;        font-size:1pt" string="CONFIDENTIAL"/>
+        </v:shape>
+      </w:pict>
+    </w:r>
+  </w:p>
+</w:hdr>
 </file>
 
 <file path=word/numbering.xml><?xml version="1.0" encoding="utf-8"?>

</xml_diff>

<commit_message>
Two-column header layout (name+phone left, LinkedIn+GitHub right), add Palantir cert to AWS resume
Co-Authored-By: Claude Opus 4.6 (1M context) <noreply@anthropic.com>
</commit_message>
<xml_diff>
--- a/outputs/2026-03-23-aws-platform/Vamshi_Resume_2026_AWS.docx
+++ b/outputs/2026-03-23-aws-platform/Vamshi_Resume_2026_AWS.docx
@@ -1371,7 +1371,13 @@
         </w:numPr>
       </w:pPr>
       <w:r>
-        <w:t xml:space="preserve">Building Generative AI Applications Using Amazon Bedrock, Agentic AI</w:t>
+        <w:t xml:space="preserve">Foundry &amp; AIP Builder Foundations (Palantir Technologies), Building</w:t>
+      </w:r>
+      <w:r>
+        <w:t xml:space="preserve"> </w:t>
+      </w:r>
+      <w:r>
+        <w:t xml:space="preserve">Generative AI Applications Using Amazon Bedrock, Agentic AI</w:t>
       </w:r>
       <w:r>
         <w:t xml:space="preserve"> </w:t>
@@ -6202,7 +6208,7 @@
       <w:headerReference r:id="rId9" w:type="default"/>
       <w:footerReference r:id="rId10" w:type="default"/>
       <w:pgSz w:h="15840" w:w="12240"/>
-      <w:pgMar w:bottom="576" w:footer="720" w:gutter="0" w:header="720" w:left="720" w:right="720" w:top="576"/>
+      <w:pgMar w:bottom="576" w:footer="576" w:gutter="0" w:header="576" w:left="720" w:right="720" w:top="576"/>
       <w:cols w:space="720"/>
       <w:docGrid w:linePitch="360"/>
     </w:sectPr>
@@ -6218,8 +6224,7 @@
 <w:ftr xmlns:m="http://schemas.openxmlformats.org/officeDocument/2006/math" xmlns:mc="http://schemas.openxmlformats.org/markup-compatibility/2006" xmlns:mo="http://schemas.microsoft.com/office/mac/office/2008/main" xmlns:mv="urn:schemas-microsoft-com:mac:vml" xmlns:o="urn:schemas-microsoft-com:office:office" xmlns:r="http://schemas.openxmlformats.org/officeDocument/2006/relationships" xmlns:v="urn:schemas-microsoft-com:vml" xmlns:w10="urn:schemas-microsoft-com:office:word" xmlns:w14="http://schemas.microsoft.com/office/word/2010/wordml" xmlns:w="http://schemas.openxmlformats.org/wordprocessingml/2006/main" xmlns:wne="http://schemas.microsoft.com/office/word/2006/wordml" xmlns:wp14="http://schemas.microsoft.com/office/word/2010/wordprocessingDrawing" xmlns:wp="http://schemas.openxmlformats.org/drawingml/2006/wordprocessingDrawing" xmlns:wpc="http://schemas.microsoft.com/office/word/2010/wordprocessingCanvas" xmlns:wpg="http://schemas.microsoft.com/office/word/2010/wordprocessingGroup" xmlns:wpi="http://schemas.microsoft.com/office/word/2010/wordprocessingInk" xmlns:wps="http://schemas.microsoft.com/office/word/2010/wordprocessingShape" mc:Ignorable="w14 wp14">
   <w:p>
     <w:pPr>
-      <w:pStyle w:val="Footer"/>
-      <w:spacing w:before="80" w:after="0"/>
+      <w:spacing w:before="60" w:after="0"/>
       <w:jc w:val="center"/>
       <w:pBdr>
         <w:top w:val="single" w:sz="4" w:space="1" w:color="CCCCCC"/>
@@ -6227,15 +6232,15 @@
     </w:pPr>
     <w:r>
       <w:rPr>
-        <w:color w:val="666666"/>
-        <w:sz w:val="15"/>
+        <w:color w:val="888888"/>
+        <w:sz w:val="14"/>
       </w:rPr>
       <w:t xml:space="preserve">Page </w:t>
     </w:r>
     <w:r>
       <w:rPr>
-        <w:color w:val="666666"/>
-        <w:sz w:val="15"/>
+        <w:color w:val="888888"/>
+        <w:sz w:val="14"/>
       </w:rPr>
       <w:fldChar w:fldCharType="begin"/>
       <w:instrText xml:space="preserve"> PAGE </w:instrText>
@@ -6244,15 +6249,15 @@
     </w:r>
     <w:r>
       <w:rPr>
-        <w:color w:val="666666"/>
-        <w:sz w:val="15"/>
+        <w:color w:val="888888"/>
+        <w:sz w:val="14"/>
       </w:rPr>
       <w:t xml:space="preserve"> of </w:t>
     </w:r>
     <w:r>
       <w:rPr>
-        <w:color w:val="666666"/>
-        <w:sz w:val="15"/>
+        <w:color w:val="888888"/>
+        <w:sz w:val="14"/>
       </w:rPr>
       <w:fldChar w:fldCharType="begin"/>
       <w:instrText xml:space="preserve"> NUMPAGES </w:instrText>
@@ -6284,51 +6289,111 @@
 
 <file path=word/header1.xml><?xml version="1.0" encoding="utf-8"?>
 <w:hdr xmlns:m="http://schemas.openxmlformats.org/officeDocument/2006/math" xmlns:mc="http://schemas.openxmlformats.org/markup-compatibility/2006" xmlns:mo="http://schemas.microsoft.com/office/mac/office/2008/main" xmlns:mv="urn:schemas-microsoft-com:mac:vml" xmlns:o="urn:schemas-microsoft-com:office:office" xmlns:r="http://schemas.openxmlformats.org/officeDocument/2006/relationships" xmlns:v="urn:schemas-microsoft-com:vml" xmlns:w10="urn:schemas-microsoft-com:office:word" xmlns:w14="http://schemas.microsoft.com/office/word/2010/wordml" xmlns:w="http://schemas.openxmlformats.org/wordprocessingml/2006/main" xmlns:wne="http://schemas.microsoft.com/office/word/2006/wordml" xmlns:wp14="http://schemas.microsoft.com/office/word/2010/wordprocessingDrawing" xmlns:wp="http://schemas.openxmlformats.org/drawingml/2006/wordprocessingDrawing" xmlns:wpc="http://schemas.microsoft.com/office/word/2010/wordprocessingCanvas" xmlns:wpg="http://schemas.microsoft.com/office/word/2010/wordprocessingGroup" xmlns:wpi="http://schemas.microsoft.com/office/word/2010/wordprocessingInk" xmlns:wps="http://schemas.microsoft.com/office/word/2010/wordprocessingShape" mc:Ignorable="w14 wp14">
+  <w:tbl>
+    <w:tblPr>
+      <w:tblW w:type="pct" w:w="5000"/>
+      <w:jc w:val="center"/>
+      <w:tblLayout w:type="autofit"/>
+      <w:tblLook w:firstColumn="1" w:firstRow="1" w:lastColumn="0" w:lastRow="0" w:noHBand="0" w:noVBand="1" w:val="04A0"/>
+      <w:tblBorders>
+        <w:top w:val="none" w:sz="0" w:space="0" w:color="auto"/>
+        <w:left w:val="none" w:sz="0" w:space="0" w:color="auto"/>
+        <w:bottom w:val="single" w:sz="4" w:space="1" w:color="CCCCCC"/>
+        <w:right w:val="none" w:sz="0" w:space="0" w:color="auto"/>
+        <w:insideH w:val="none" w:sz="0" w:space="0" w:color="auto"/>
+        <w:insideV w:val="none" w:sz="0" w:space="0" w:color="auto"/>
+      </w:tblBorders>
+    </w:tblPr>
+    <w:tblGrid>
+      <w:gridCol w:w="5400"/>
+      <w:gridCol w:w="5400"/>
+    </w:tblGrid>
+    <w:tr>
+      <w:tc>
+        <w:tcPr>
+          <w:tcW w:type="dxa" w:w="5400"/>
+          <w:tcMar>
+            <w:top w:w="0" w:type="dxa"/>
+            <w:bottom w:w="30" w:type="dxa"/>
+            <w:left w:w="0" w:type="dxa"/>
+            <w:right w:w="0" w:type="dxa"/>
+          </w:tcMar>
+        </w:tcPr>
+        <w:p>
+          <w:pPr>
+            <w:spacing w:after="0" w:before="0"/>
+            <w:jc w:val="left"/>
+          </w:pPr>
+          <w:r>
+            <w:rPr>
+              <w:b/>
+              <w:color w:val="1A1A1A"/>
+              <w:sz w:val="17"/>
+            </w:rPr>
+            <w:t>Vamshi Singam</w:t>
+          </w:r>
+          <w:r>
+            <w:rPr>
+              <w:color w:val="AAAAAA"/>
+              <w:sz w:val="16"/>
+            </w:rPr>
+            <w:t xml:space="preserve">  |  </w:t>
+          </w:r>
+          <w:r>
+            <w:rPr>
+              <w:color w:val="444444"/>
+              <w:sz w:val="16"/>
+            </w:rPr>
+            <w:t>+1 346-666-1192</w:t>
+          </w:r>
+        </w:p>
+      </w:tc>
+      <w:tc>
+        <w:tcPr>
+          <w:tcW w:type="dxa" w:w="5400"/>
+          <w:tcMar>
+            <w:top w:w="0" w:type="dxa"/>
+            <w:bottom w:w="30" w:type="dxa"/>
+            <w:left w:w="0" w:type="dxa"/>
+            <w:right w:w="0" w:type="dxa"/>
+          </w:tcMar>
+        </w:tcPr>
+        <w:p>
+          <w:pPr>
+            <w:spacing w:after="0" w:before="0"/>
+            <w:jc w:val="right"/>
+          </w:pPr>
+          <w:r>
+            <w:rPr>
+              <w:color w:val="0077B5"/>
+              <w:sz w:val="15"/>
+              <w:u w:val="single"/>
+            </w:rPr>
+            <w:t>LinkedIn</w:t>
+          </w:r>
+          <w:r>
+            <w:rPr>
+              <w:color w:val="AAAAAA"/>
+              <w:sz w:val="15"/>
+            </w:rPr>
+            <w:t xml:space="preserve">  |  </w:t>
+          </w:r>
+          <w:r>
+            <w:rPr>
+              <w:color w:val="333333"/>
+              <w:sz w:val="15"/>
+              <w:u w:val="single"/>
+            </w:rPr>
+            <w:t>GitHub</w:t>
+          </w:r>
+        </w:p>
+      </w:tc>
+    </w:tr>
+  </w:tbl>
   <w:p>
     <w:pPr>
-      <w:pStyle w:val="Header"/>
-      <w:spacing w:after="40" w:before="0"/>
-      <w:jc w:val="center"/>
-      <w:pBdr>
-        <w:bottom w:val="single" w:sz="4" w:space="1" w:color="CCCCCC"/>
-      </w:pBdr>
+      <w:spacing w:after="0" w:before="0"/>
     </w:pPr>
-    <w:r>
-      <w:rPr>
-        <w:b/>
-        <w:color w:val="333333"/>
-        <w:sz w:val="16"/>
-      </w:rPr>
-      <w:t>Vamshi Singam</w:t>
-    </w:r>
-    <w:r>
-      <w:rPr>
-        <w:color w:val="999999"/>
-        <w:sz w:val="16"/>
-      </w:rPr>
-      <w:t xml:space="preserve">  |  </w:t>
-    </w:r>
-    <w:r>
-      <w:rPr>
-        <w:color w:val="0077B5"/>
-        <w:sz w:val="15"/>
-      </w:rPr>
-      <w:t>linkedin.com/in/vamshi-singam-82963556</w:t>
-    </w:r>
-    <w:r>
-      <w:rPr>
-        <w:color w:val="999999"/>
-        <w:sz w:val="16"/>
-      </w:rPr>
-      <w:t xml:space="preserve">  |  </w:t>
-    </w:r>
-    <w:r>
-      <w:rPr>
-        <w:color w:val="333333"/>
-        <w:sz w:val="15"/>
-      </w:rPr>
-      <w:t>github.com/vamshi455</w:t>
-    </w:r>
     <w:r>
       <w:rPr>
         <w:noProof/>
@@ -6359,7 +6424,7 @@
           <o:lock v:ext="edit" text="t" shapetype="t"/>
         </v:shapetype>
         <v:shape id="PowerPlusWaterMarkObject" o:spid="_x0000_s2049" type="#_x0000_t136" style="position:absolute;margin-left:0;margin-top:0;      width:500pt;height:100pt;rotation:315;      z-index:-251658752;mso-position-horizontal:center;      mso-position-horizontal-relative:margin;      mso-position-vertical:center;      mso-position-vertical-relative:margin" o:allowincell="f" fillcolor="#F0F0F0" stroked="f">
-          <v:fill opacity=".15"/>
+          <v:fill opacity=".12"/>
           <v:textpath style="font-family:&quot;Calibri&quot;;        font-size:1pt" string="CONFIDENTIAL"/>
         </v:shape>
       </w:pict>

</xml_diff>

<commit_message>
Fix header: clickable LinkedIn/GitHub hyperlinks, remove duplicate contact line from body
Header now: left = Name • Phone • Email, right = LinkedIn • GitHub (clickable).
Removed redundant contact line from page 1 body in master, AWS, and Palantir resumes.

Co-Authored-By: Claude Opus 4.6 (1M context) <noreply@anthropic.com>
</commit_message>
<xml_diff>
--- a/outputs/2026-03-23-aws-platform/Vamshi_Resume_2026_AWS.docx
+++ b/outputs/2026-03-23-aws-platform/Vamshi_Resume_2026_AWS.docx
@@ -2,7 +2,7 @@
 <file path=word/document.xml><?xml version="1.0" encoding="utf-8"?>
 <w:document xmlns:w="http://schemas.openxmlformats.org/wordprocessingml/2006/main" xmlns:m="http://schemas.openxmlformats.org/officeDocument/2006/math" xmlns:r="http://schemas.openxmlformats.org/officeDocument/2006/relationships" xmlns:o="urn:schemas-microsoft-com:office:office" xmlns:v="urn:schemas-microsoft-com:vml" xmlns:w10="urn:schemas-microsoft-com:office:word" xmlns:a="http://schemas.openxmlformats.org/drawingml/2006/main" xmlns:pic="http://schemas.openxmlformats.org/drawingml/2006/picture" xmlns:wp="http://schemas.openxmlformats.org/drawingml/2006/wordprocessingDrawing">
   <w:body>
-    <w:bookmarkStart w:id="22" w:name="vamshi-singam"/>
+    <w:bookmarkStart w:id="19" w:name="vamshi-singam"/>
     <w:p>
       <w:pPr>
         <w:pStyle w:val="Heading1"/>
@@ -22,69 +22,6 @@
         </w:rPr>
         <w:t xml:space="preserve">Lead Data Engineer | Agentic AI Solutions Architect</w:t>
       </w:r>
-    </w:p>
-    <w:p>
-      <w:pPr>
-        <w:pStyle w:val="BodyText"/>
-      </w:pPr>
-      <w:r>
-        <w:rPr>
-          <w:b/>
-          <w:bCs/>
-        </w:rPr>
-        <w:t xml:space="preserve">+1 346-666-1192</w:t>
-      </w:r>
-      <w:r>
-        <w:t xml:space="preserve"> </w:t>
-      </w:r>
-      <w:r>
-        <w:t xml:space="preserve">|</w:t>
-      </w:r>
-      <w:r>
-        <w:t xml:space="preserve"> </w:t>
-      </w:r>
-      <w:hyperlink r:id="rId19">
-        <w:r>
-          <w:rPr>
-            <w:rStyle w:val="Hyperlink"/>
-          </w:rPr>
-          <w:t xml:space="preserve">vamshi455@gmail.com</w:t>
-        </w:r>
-      </w:hyperlink>
-      <w:r>
-        <w:t xml:space="preserve"> </w:t>
-      </w:r>
-      <w:r>
-        <w:t xml:space="preserve">|</w:t>
-      </w:r>
-      <w:r>
-        <w:t xml:space="preserve"> </w:t>
-      </w:r>
-      <w:hyperlink r:id="rId20">
-        <w:r>
-          <w:rPr>
-            <w:rStyle w:val="Hyperlink"/>
-          </w:rPr>
-          <w:t xml:space="preserve">LinkedIn</w:t>
-        </w:r>
-      </w:hyperlink>
-      <w:r>
-        <w:t xml:space="preserve"> </w:t>
-      </w:r>
-      <w:r>
-        <w:t xml:space="preserve">|</w:t>
-      </w:r>
-      <w:r>
-        <w:t xml:space="preserve"> </w:t>
-      </w:r>
-      <w:hyperlink r:id="rId21">
-        <w:r>
-          <w:rPr>
-            <w:rStyle w:val="Hyperlink"/>
-          </w:rPr>
-          <w:t xml:space="preserve">GitHub</w:t>
-        </w:r>
-      </w:hyperlink>
     </w:p>
     <w:p>
       <w:pPr>
@@ -6203,7 +6140,7 @@
         <w:t xml:space="preserve">ASP.NET, VB.NET, SQL Server, HTML, CSS</w:t>
       </w:r>
     </w:p>
-    <w:bookmarkEnd w:id="22"/>
+    <w:bookmarkEnd w:id="19"/>
     <w:sectPr>
       <w:headerReference r:id="rId9" w:type="default"/>
       <w:footerReference r:id="rId10" w:type="default"/>
@@ -6227,7 +6164,7 @@
       <w:spacing w:before="60" w:after="0"/>
       <w:jc w:val="center"/>
       <w:pBdr>
-        <w:top w:val="single" w:sz="4" w:space="1" w:color="CCCCCC"/>
+        <w:top w:val="single" w:sz="4" w:space="1" w:color="0077B5"/>
       </w:pBdr>
     </w:pPr>
     <w:r>
@@ -6298,7 +6235,7 @@
       <w:tblBorders>
         <w:top w:val="none" w:sz="0" w:space="0" w:color="auto"/>
         <w:left w:val="none" w:sz="0" w:space="0" w:color="auto"/>
-        <w:bottom w:val="single" w:sz="4" w:space="1" w:color="CCCCCC"/>
+        <w:bottom w:val="single" w:sz="6" w:space="1" w:color="0077B5"/>
         <w:right w:val="none" w:sz="0" w:space="0" w:color="auto"/>
         <w:insideH w:val="none" w:sz="0" w:space="0" w:color="auto"/>
         <w:insideV w:val="none" w:sz="0" w:space="0" w:color="auto"/>
@@ -6314,37 +6251,51 @@
           <w:tcW w:type="dxa" w:w="5400"/>
           <w:tcMar>
             <w:top w:w="0" w:type="dxa"/>
-            <w:bottom w:w="30" w:type="dxa"/>
+            <w:bottom w:w="20" w:type="dxa"/>
             <w:left w:w="0" w:type="dxa"/>
             <w:right w:w="0" w:type="dxa"/>
           </w:tcMar>
         </w:tcPr>
         <w:p>
           <w:pPr>
-            <w:spacing w:after="0" w:before="0"/>
+            <w:spacing w:after="20" w:before="0"/>
             <w:jc w:val="left"/>
           </w:pPr>
           <w:r>
             <w:rPr>
               <w:b/>
               <w:color w:val="1A1A1A"/>
-              <w:sz w:val="17"/>
+              <w:sz w:val="18"/>
             </w:rPr>
             <w:t>Vamshi Singam</w:t>
           </w:r>
           <w:r>
             <w:rPr>
               <w:color w:val="AAAAAA"/>
-              <w:sz w:val="16"/>
+              <w:sz w:val="14"/>
             </w:rPr>
-            <w:t xml:space="preserve">  |  </w:t>
+            <w:t xml:space="preserve">  •  </w:t>
           </w:r>
           <w:r>
             <w:rPr>
               <w:color w:val="444444"/>
-              <w:sz w:val="16"/>
+              <w:sz w:val="15"/>
             </w:rPr>
             <w:t>+1 346-666-1192</w:t>
+          </w:r>
+          <w:r>
+            <w:rPr>
+              <w:color w:val="AAAAAA"/>
+              <w:sz w:val="14"/>
+            </w:rPr>
+            <w:t xml:space="preserve">  •  </w:t>
+          </w:r>
+          <w:r>
+            <w:rPr>
+              <w:color w:val="444444"/>
+              <w:sz w:val="15"/>
+            </w:rPr>
+            <w:t>vamshi455@gmail.com</w:t>
           </w:r>
         </w:p>
       </w:tc>
@@ -6353,39 +6304,47 @@
           <w:tcW w:type="dxa" w:w="5400"/>
           <w:tcMar>
             <w:top w:w="0" w:type="dxa"/>
-            <w:bottom w:w="30" w:type="dxa"/>
+            <w:bottom w:w="20" w:type="dxa"/>
             <w:left w:w="0" w:type="dxa"/>
             <w:right w:w="0" w:type="dxa"/>
           </w:tcMar>
         </w:tcPr>
         <w:p>
           <w:pPr>
-            <w:spacing w:after="0" w:before="0"/>
+            <w:spacing w:after="20" w:before="0"/>
             <w:jc w:val="right"/>
           </w:pPr>
-          <w:r>
-            <w:rPr>
-              <w:color w:val="0077B5"/>
-              <w:sz w:val="15"/>
-              <w:u w:val="single"/>
-            </w:rPr>
-            <w:t>LinkedIn</w:t>
-          </w:r>
+          <w:hyperlink r:id="rId1">
+            <w:r>
+              <w:rPr>
+                <w:rStyle w:val="Hyperlink"/>
+                <w:color w:val="0077B5"/>
+                <w:sz w:val="15"/>
+                <w:szCs w:val="15"/>
+                <w:u w:val="single"/>
+              </w:rPr>
+              <w:t>LinkedIn</w:t>
+            </w:r>
+          </w:hyperlink>
           <w:r>
             <w:rPr>
               <w:color w:val="AAAAAA"/>
-              <w:sz w:val="15"/>
+              <w:sz w:val="14"/>
             </w:rPr>
-            <w:t xml:space="preserve">  |  </w:t>
+            <w:t xml:space="preserve">  •  </w:t>
           </w:r>
-          <w:r>
-            <w:rPr>
-              <w:color w:val="333333"/>
-              <w:sz w:val="15"/>
-              <w:u w:val="single"/>
-            </w:rPr>
-            <w:t>GitHub</w:t>
-          </w:r>
+          <w:hyperlink r:id="rId2">
+            <w:r>
+              <w:rPr>
+                <w:rStyle w:val="Hyperlink"/>
+                <w:color w:val="333333"/>
+                <w:sz w:val="15"/>
+                <w:szCs w:val="15"/>
+                <w:u w:val="single"/>
+              </w:rPr>
+              <w:t>GitHub</w:t>
+            </w:r>
+          </w:hyperlink>
         </w:p>
       </w:tc>
     </w:tr>
@@ -6425,7 +6384,7 @@
         </v:shapetype>
         <v:shape id="PowerPlusWaterMarkObject" o:spid="_x0000_s2049" type="#_x0000_t136" style="position:absolute;margin-left:0;margin-top:0;      width:500pt;height:100pt;rotation:315;      z-index:-251658752;mso-position-horizontal:center;      mso-position-horizontal-relative:margin;      mso-position-vertical:center;      mso-position-vertical-relative:margin" o:allowincell="f" fillcolor="#F0F0F0" stroked="f">
           <v:fill opacity=".12"/>
-          <v:textpath style="font-family:&quot;Calibri&quot;;        font-size:1pt" string="CONFIDENTIAL"/>
+          <v:textpath style="font-family:&quot;Calibri&quot;;font-size:1pt" string="CONFIDENTIAL"/>
         </v:shape>
       </w:pict>
     </w:r>

</xml_diff>

<commit_message>
Fix header hyperlinks: LinkedIn and GitHub now clickable via header part relationships
Previous approach used doc-level rels which broke in headers.
Now hyperlinks are registered against the header's own relationship store.
Verified: rId1=LinkedIn, rId2=GitHub correctly embedded.

Co-Authored-By: Claude Opus 4.6 (1M context) <noreply@anthropic.com>
</commit_message>
<xml_diff>
--- a/outputs/2026-03-23-aws-platform/Vamshi_Resume_2026_AWS.docx
+++ b/outputs/2026-03-23-aws-platform/Vamshi_Resume_2026_AWS.docx
@@ -6176,7 +6176,6 @@
     </w:r>
     <w:r>
       <w:rPr>
-        <w:color w:val="888888"/>
         <w:sz w:val="14"/>
       </w:rPr>
       <w:fldChar w:fldCharType="begin"/>
@@ -6193,7 +6192,6 @@
     </w:r>
     <w:r>
       <w:rPr>
-        <w:color w:val="888888"/>
         <w:sz w:val="14"/>
       </w:rPr>
       <w:fldChar w:fldCharType="begin"/>
@@ -6317,7 +6315,6 @@
           <w:hyperlink r:id="rId1">
             <w:r>
               <w:rPr>
-                <w:rStyle w:val="Hyperlink"/>
                 <w:color w:val="0077B5"/>
                 <w:sz w:val="15"/>
                 <w:szCs w:val="15"/>
@@ -6336,7 +6333,6 @@
           <w:hyperlink r:id="rId2">
             <w:r>
               <w:rPr>
-                <w:rStyle w:val="Hyperlink"/>
                 <w:color w:val="333333"/>
                 <w:sz w:val="15"/>
                 <w:szCs w:val="15"/>
@@ -6382,7 +6378,7 @@
           </v:handles>
           <o:lock v:ext="edit" text="t" shapetype="t"/>
         </v:shapetype>
-        <v:shape id="PowerPlusWaterMarkObject" o:spid="_x0000_s2049" type="#_x0000_t136" style="position:absolute;margin-left:0;margin-top:0;      width:500pt;height:100pt;rotation:315;      z-index:-251658752;mso-position-horizontal:center;      mso-position-horizontal-relative:margin;      mso-position-vertical:center;      mso-position-vertical-relative:margin" o:allowincell="f" fillcolor="#F0F0F0" stroked="f">
+        <v:shape id="PowerPlusWaterMarkObject" o:spid="_x0000_s2049" type="#_x0000_t136" style="position:absolute;margin-left:0;margin-top:0;width:500pt;height:100pt;rotation:315;z-index:-251658752;mso-position-horizontal:center;mso-position-horizontal-relative:margin;mso-position-vertical:center;mso-position-vertical-relative:margin" o:allowincell="f" fillcolor="#F0F0F0" stroked="f">
           <v:fill opacity=".12"/>
           <v:textpath style="font-family:&quot;Calibri&quot;;font-size:1pt" string="CONFIDENTIAL"/>
         </v:shape>

</xml_diff>

<commit_message>
Post-process docx after pandoc for working header/footer hyperlinks
New approach: pandoc generates docx first, then add_header_footer.py
injects header (name/phone/email left, LinkedIn/GitHub right with
clickable hyperlinks), footer (Page X of Y), and CONFIDENTIAL watermark.
Updated export_to_pdf.sh to run both steps automatically.

Co-Authored-By: Claude Opus 4.6 (1M context) <noreply@anthropic.com>
</commit_message>
<xml_diff>
--- a/outputs/2026-03-23-aws-platform/Vamshi_Resume_2026_AWS.docx
+++ b/outputs/2026-03-23-aws-platform/Vamshi_Resume_2026_AWS.docx
@@ -6176,6 +6176,7 @@
     </w:r>
     <w:r>
       <w:rPr>
+        <w:color w:val="888888"/>
         <w:sz w:val="14"/>
       </w:rPr>
       <w:fldChar w:fldCharType="begin"/>
@@ -6192,6 +6193,7 @@
     </w:r>
     <w:r>
       <w:rPr>
+        <w:color w:val="888888"/>
         <w:sz w:val="14"/>
       </w:rPr>
       <w:fldChar w:fldCharType="begin"/>
@@ -6226,7 +6228,6 @@
 <w:hdr xmlns:m="http://schemas.openxmlformats.org/officeDocument/2006/math" xmlns:mc="http://schemas.openxmlformats.org/markup-compatibility/2006" xmlns:mo="http://schemas.microsoft.com/office/mac/office/2008/main" xmlns:mv="urn:schemas-microsoft-com:mac:vml" xmlns:o="urn:schemas-microsoft-com:office:office" xmlns:r="http://schemas.openxmlformats.org/officeDocument/2006/relationships" xmlns:v="urn:schemas-microsoft-com:vml" xmlns:w10="urn:schemas-microsoft-com:office:word" xmlns:w14="http://schemas.microsoft.com/office/word/2010/wordml" xmlns:w="http://schemas.openxmlformats.org/wordprocessingml/2006/main" xmlns:wne="http://schemas.microsoft.com/office/word/2006/wordml" xmlns:wp14="http://schemas.microsoft.com/office/word/2010/wordprocessingDrawing" xmlns:wp="http://schemas.openxmlformats.org/drawingml/2006/wordprocessingDrawing" xmlns:wpc="http://schemas.microsoft.com/office/word/2010/wordprocessingCanvas" xmlns:wpg="http://schemas.microsoft.com/office/word/2010/wordprocessingGroup" xmlns:wpi="http://schemas.microsoft.com/office/word/2010/wordprocessingInk" xmlns:wps="http://schemas.microsoft.com/office/word/2010/wordprocessingShape" mc:Ignorable="w14 wp14">
   <w:tbl>
     <w:tblPr>
-      <w:tblW w:type="pct" w:w="5000"/>
       <w:jc w:val="center"/>
       <w:tblLayout w:type="autofit"/>
       <w:tblLook w:firstColumn="1" w:firstRow="1" w:lastColumn="0" w:lastRow="0" w:noHBand="0" w:noVBand="1" w:val="04A0"/>
@@ -6238,6 +6239,7 @@
         <w:insideH w:val="none" w:sz="0" w:space="0" w:color="auto"/>
         <w:insideV w:val="none" w:sz="0" w:space="0" w:color="auto"/>
       </w:tblBorders>
+      <w:tblW w:type="pct" w:w="5000"/>
     </w:tblPr>
     <w:tblGrid>
       <w:gridCol w:w="5400"/>

</xml_diff>

<commit_message>
Remove hyperlinks from header, use plain text URLs for LinkedIn and GitHub
Avoids client-side hyperlink rendering issues. Header now shows
plain text URLs (linkedin.com/in/... and github.com/...) on the right,
name/phone/email on the left — no clickable links.

Co-Authored-By: Claude Opus 4.6 (1M context) <noreply@anthropic.com>
</commit_message>
<xml_diff>
--- a/outputs/2026-03-23-aws-platform/Vamshi_Resume_2026_AWS.docx
+++ b/outputs/2026-03-23-aws-platform/Vamshi_Resume_2026_AWS.docx
@@ -6314,17 +6314,13 @@
             <w:spacing w:after="20" w:before="0"/>
             <w:jc w:val="right"/>
           </w:pPr>
-          <w:hyperlink r:id="rId1">
-            <w:r>
-              <w:rPr>
-                <w:color w:val="0077B5"/>
-                <w:sz w:val="15"/>
-                <w:szCs w:val="15"/>
-                <w:u w:val="single"/>
-              </w:rPr>
-              <w:t>LinkedIn</w:t>
-            </w:r>
-          </w:hyperlink>
+          <w:r>
+            <w:rPr>
+              <w:color w:val="0077B5"/>
+              <w:sz w:val="15"/>
+            </w:rPr>
+            <w:t>linkedin.com/in/vamshi-singam-82963556</w:t>
+          </w:r>
           <w:r>
             <w:rPr>
               <w:color w:val="AAAAAA"/>
@@ -6332,17 +6328,13 @@
             </w:rPr>
             <w:t xml:space="preserve">  •  </w:t>
           </w:r>
-          <w:hyperlink r:id="rId2">
-            <w:r>
-              <w:rPr>
-                <w:color w:val="333333"/>
-                <w:sz w:val="15"/>
-                <w:szCs w:val="15"/>
-                <w:u w:val="single"/>
-              </w:rPr>
-              <w:t>GitHub</w:t>
-            </w:r>
-          </w:hyperlink>
+          <w:r>
+            <w:rPr>
+              <w:color w:val="333333"/>
+              <w:sz w:val="15"/>
+            </w:rPr>
+            <w:t>github.com/vamshi455</w:t>
+          </w:r>
         </w:p>
       </w:tc>
     </w:tr>

</xml_diff>

<commit_message>
Remove header bar and footer; show only LinkedIn + GitHub URLs top-right on every page
No visible header/footer chrome — just right-aligned LinkedIn and GitHub
URLs in the Word header area. No borders, no name/phone/email repeat,
no page numbers. Clean and minimal. Rule added to CLAUDE.md.

Co-Authored-By: Claude Opus 4.6 (1M context) <noreply@anthropic.com>
</commit_message>
<xml_diff>
--- a/outputs/2026-03-23-aws-platform/Vamshi_Resume_2026_AWS.docx
+++ b/outputs/2026-03-23-aws-platform/Vamshi_Resume_2026_AWS.docx
@@ -6145,7 +6145,7 @@
       <w:headerReference r:id="rId9" w:type="default"/>
       <w:footerReference r:id="rId10" w:type="default"/>
       <w:pgSz w:h="15840" w:w="12240"/>
-      <w:pgMar w:bottom="576" w:footer="576" w:gutter="0" w:header="576" w:left="720" w:right="720" w:top="576"/>
+      <w:pgMar w:bottom="576" w:footer="432" w:gutter="0" w:header="432" w:left="720" w:right="720" w:top="576"/>
       <w:cols w:space="720"/>
       <w:docGrid w:linePitch="360"/>
     </w:sectPr>
@@ -6161,46 +6161,8 @@
 <w:ftr xmlns:m="http://schemas.openxmlformats.org/officeDocument/2006/math" xmlns:mc="http://schemas.openxmlformats.org/markup-compatibility/2006" xmlns:mo="http://schemas.microsoft.com/office/mac/office/2008/main" xmlns:mv="urn:schemas-microsoft-com:mac:vml" xmlns:o="urn:schemas-microsoft-com:office:office" xmlns:r="http://schemas.openxmlformats.org/officeDocument/2006/relationships" xmlns:v="urn:schemas-microsoft-com:vml" xmlns:w10="urn:schemas-microsoft-com:office:word" xmlns:w14="http://schemas.microsoft.com/office/word/2010/wordml" xmlns:w="http://schemas.openxmlformats.org/wordprocessingml/2006/main" xmlns:wne="http://schemas.microsoft.com/office/word/2006/wordml" xmlns:wp14="http://schemas.microsoft.com/office/word/2010/wordprocessingDrawing" xmlns:wp="http://schemas.openxmlformats.org/drawingml/2006/wordprocessingDrawing" xmlns:wpc="http://schemas.microsoft.com/office/word/2010/wordprocessingCanvas" xmlns:wpg="http://schemas.microsoft.com/office/word/2010/wordprocessingGroup" xmlns:wpi="http://schemas.microsoft.com/office/word/2010/wordprocessingInk" xmlns:wps="http://schemas.microsoft.com/office/word/2010/wordprocessingShape" mc:Ignorable="w14 wp14">
   <w:p>
     <w:pPr>
-      <w:spacing w:before="60" w:after="0"/>
-      <w:jc w:val="center"/>
-      <w:pBdr>
-        <w:top w:val="single" w:sz="4" w:space="1" w:color="0077B5"/>
-      </w:pBdr>
+      <w:spacing w:after="0" w:before="0"/>
     </w:pPr>
-    <w:r>
-      <w:rPr>
-        <w:color w:val="888888"/>
-        <w:sz w:val="14"/>
-      </w:rPr>
-      <w:t xml:space="preserve">Page </w:t>
-    </w:r>
-    <w:r>
-      <w:rPr>
-        <w:color w:val="888888"/>
-        <w:sz w:val="14"/>
-      </w:rPr>
-      <w:fldChar w:fldCharType="begin"/>
-      <w:instrText xml:space="preserve"> PAGE </w:instrText>
-      <w:fldChar w:fldCharType="separate"/>
-      <w:fldChar w:fldCharType="end"/>
-    </w:r>
-    <w:r>
-      <w:rPr>
-        <w:color w:val="888888"/>
-        <w:sz w:val="14"/>
-      </w:rPr>
-      <w:t xml:space="preserve"> of </w:t>
-    </w:r>
-    <w:r>
-      <w:rPr>
-        <w:color w:val="888888"/>
-        <w:sz w:val="14"/>
-      </w:rPr>
-      <w:fldChar w:fldCharType="begin"/>
-      <w:instrText xml:space="preserve"> NUMPAGES </w:instrText>
-      <w:fldChar w:fldCharType="separate"/>
-      <w:fldChar w:fldCharType="end"/>
-    </w:r>
   </w:p>
 </w:ftr>
 </file>
@@ -6226,157 +6188,31 @@
 
 <file path=word/header1.xml><?xml version="1.0" encoding="utf-8"?>
 <w:hdr xmlns:m="http://schemas.openxmlformats.org/officeDocument/2006/math" xmlns:mc="http://schemas.openxmlformats.org/markup-compatibility/2006" xmlns:mo="http://schemas.microsoft.com/office/mac/office/2008/main" xmlns:mv="urn:schemas-microsoft-com:mac:vml" xmlns:o="urn:schemas-microsoft-com:office:office" xmlns:r="http://schemas.openxmlformats.org/officeDocument/2006/relationships" xmlns:v="urn:schemas-microsoft-com:vml" xmlns:w10="urn:schemas-microsoft-com:office:word" xmlns:w14="http://schemas.microsoft.com/office/word/2010/wordml" xmlns:w="http://schemas.openxmlformats.org/wordprocessingml/2006/main" xmlns:wne="http://schemas.microsoft.com/office/word/2006/wordml" xmlns:wp14="http://schemas.microsoft.com/office/word/2010/wordprocessingDrawing" xmlns:wp="http://schemas.openxmlformats.org/drawingml/2006/wordprocessingDrawing" xmlns:wpc="http://schemas.microsoft.com/office/word/2010/wordprocessingCanvas" xmlns:wpg="http://schemas.microsoft.com/office/word/2010/wordprocessingGroup" xmlns:wpi="http://schemas.microsoft.com/office/word/2010/wordprocessingInk" xmlns:wps="http://schemas.microsoft.com/office/word/2010/wordprocessingShape" mc:Ignorable="w14 wp14">
-  <w:tbl>
-    <w:tblPr>
-      <w:jc w:val="center"/>
-      <w:tblLayout w:type="autofit"/>
-      <w:tblLook w:firstColumn="1" w:firstRow="1" w:lastColumn="0" w:lastRow="0" w:noHBand="0" w:noVBand="1" w:val="04A0"/>
-      <w:tblBorders>
-        <w:top w:val="none" w:sz="0" w:space="0" w:color="auto"/>
-        <w:left w:val="none" w:sz="0" w:space="0" w:color="auto"/>
-        <w:bottom w:val="single" w:sz="6" w:space="1" w:color="0077B5"/>
-        <w:right w:val="none" w:sz="0" w:space="0" w:color="auto"/>
-        <w:insideH w:val="none" w:sz="0" w:space="0" w:color="auto"/>
-        <w:insideV w:val="none" w:sz="0" w:space="0" w:color="auto"/>
-      </w:tblBorders>
-      <w:tblW w:type="pct" w:w="5000"/>
-    </w:tblPr>
-    <w:tblGrid>
-      <w:gridCol w:w="5400"/>
-      <w:gridCol w:w="5400"/>
-    </w:tblGrid>
-    <w:tr>
-      <w:tc>
-        <w:tcPr>
-          <w:tcW w:type="dxa" w:w="5400"/>
-          <w:tcMar>
-            <w:top w:w="0" w:type="dxa"/>
-            <w:bottom w:w="20" w:type="dxa"/>
-            <w:left w:w="0" w:type="dxa"/>
-            <w:right w:w="0" w:type="dxa"/>
-          </w:tcMar>
-        </w:tcPr>
-        <w:p>
-          <w:pPr>
-            <w:spacing w:after="20" w:before="0"/>
-            <w:jc w:val="left"/>
-          </w:pPr>
-          <w:r>
-            <w:rPr>
-              <w:b/>
-              <w:color w:val="1A1A1A"/>
-              <w:sz w:val="18"/>
-            </w:rPr>
-            <w:t>Vamshi Singam</w:t>
-          </w:r>
-          <w:r>
-            <w:rPr>
-              <w:color w:val="AAAAAA"/>
-              <w:sz w:val="14"/>
-            </w:rPr>
-            <w:t xml:space="preserve">  •  </w:t>
-          </w:r>
-          <w:r>
-            <w:rPr>
-              <w:color w:val="444444"/>
-              <w:sz w:val="15"/>
-            </w:rPr>
-            <w:t>+1 346-666-1192</w:t>
-          </w:r>
-          <w:r>
-            <w:rPr>
-              <w:color w:val="AAAAAA"/>
-              <w:sz w:val="14"/>
-            </w:rPr>
-            <w:t xml:space="preserve">  •  </w:t>
-          </w:r>
-          <w:r>
-            <w:rPr>
-              <w:color w:val="444444"/>
-              <w:sz w:val="15"/>
-            </w:rPr>
-            <w:t>vamshi455@gmail.com</w:t>
-          </w:r>
-        </w:p>
-      </w:tc>
-      <w:tc>
-        <w:tcPr>
-          <w:tcW w:type="dxa" w:w="5400"/>
-          <w:tcMar>
-            <w:top w:w="0" w:type="dxa"/>
-            <w:bottom w:w="20" w:type="dxa"/>
-            <w:left w:w="0" w:type="dxa"/>
-            <w:right w:w="0" w:type="dxa"/>
-          </w:tcMar>
-        </w:tcPr>
-        <w:p>
-          <w:pPr>
-            <w:spacing w:after="20" w:before="0"/>
-            <w:jc w:val="right"/>
-          </w:pPr>
-          <w:r>
-            <w:rPr>
-              <w:color w:val="0077B5"/>
-              <w:sz w:val="15"/>
-            </w:rPr>
-            <w:t>linkedin.com/in/vamshi-singam-82963556</w:t>
-          </w:r>
-          <w:r>
-            <w:rPr>
-              <w:color w:val="AAAAAA"/>
-              <w:sz w:val="14"/>
-            </w:rPr>
-            <w:t xml:space="preserve">  •  </w:t>
-          </w:r>
-          <w:r>
-            <w:rPr>
-              <w:color w:val="333333"/>
-              <w:sz w:val="15"/>
-            </w:rPr>
-            <w:t>github.com/vamshi455</w:t>
-          </w:r>
-        </w:p>
-      </w:tc>
-    </w:tr>
-  </w:tbl>
   <w:p>
     <w:pPr>
       <w:spacing w:after="0" w:before="0"/>
+      <w:jc w:val="right"/>
     </w:pPr>
     <w:r>
       <w:rPr>
-        <w:noProof/>
-      </w:rPr>
-      <w:pict>
-        <v:shapetype id="_x0000_t136" coordsize="21600,21600" o:spt="136" adj="10800" path="m@7,l@8,m@5,21600l@6,21600e">
-          <v:formulas>
-            <v:f eqn="sum #0 0 10800"/>
-            <v:f eqn="prod #0 2 1"/>
-            <v:f eqn="sum 21600 0 @1"/>
-            <v:f eqn="sum 0 0 @2"/>
-            <v:f eqn="sum 21600 0 @3"/>
-            <v:f eqn="if @0 @3 0"/>
-            <v:f eqn="if @0 21600 @1"/>
-            <v:f eqn="if @0 0 @2"/>
-            <v:f eqn="if @0 @4 21600"/>
-            <v:f eqn="mid @5 @6"/>
-            <v:f eqn="mid @8 @5"/>
-            <v:f eqn="mid @7 @8"/>
-            <v:f eqn="mid @6 @7"/>
-            <v:f eqn="sum @6 0 @5"/>
-          </v:formulas>
-          <v:path textpathok="t" o:connecttype="custom" o:connectlocs="@9,0;@10,10800;@11,21600;@12,10800" o:connectangles="270,180,90,0"/>
-          <v:textpath on="t" fitshape="t"/>
-          <v:handles>
-            <v:h position="#0,bottomRight" xrange="6629,14971"/>
-          </v:handles>
-          <o:lock v:ext="edit" text="t" shapetype="t"/>
-        </v:shapetype>
-        <v:shape id="PowerPlusWaterMarkObject" o:spid="_x0000_s2049" type="#_x0000_t136" style="position:absolute;margin-left:0;margin-top:0;width:500pt;height:100pt;rotation:315;z-index:-251658752;mso-position-horizontal:center;mso-position-horizontal-relative:margin;mso-position-vertical:center;mso-position-vertical-relative:margin" o:allowincell="f" fillcolor="#F0F0F0" stroked="f">
-          <v:fill opacity=".12"/>
-          <v:textpath style="font-family:&quot;Calibri&quot;;font-size:1pt" string="CONFIDENTIAL"/>
-        </v:shape>
-      </w:pict>
+        <w:color w:val="0077B5"/>
+        <w:sz w:val="15"/>
+      </w:rPr>
+      <w:t>linkedin.com/in/vamshi-singam-82963556</w:t>
+    </w:r>
+    <w:r>
+      <w:rPr>
+        <w:color w:val="BBBBBB"/>
+        <w:sz w:val="14"/>
+      </w:rPr>
+      <w:t xml:space="preserve">  |  </w:t>
+    </w:r>
+    <w:r>
+      <w:rPr>
+        <w:color w:val="333333"/>
+        <w:sz w:val="15"/>
+      </w:rPr>
+      <w:t>github.com/vamshi455</w:t>
     </w:r>
   </w:p>
 </w:hdr>

</xml_diff>

<commit_message>
Remove all headers and footers from resume docx exports
Co-Authored-By: Claude Opus 4.6 (1M context) <noreply@anthropic.com>
</commit_message>
<xml_diff>
--- a/outputs/2026-03-23-aws-platform/Vamshi_Resume_2026_AWS.docx
+++ b/outputs/2026-03-23-aws-platform/Vamshi_Resume_2026_AWS.docx
@@ -6145,7 +6145,7 @@
       <w:headerReference r:id="rId9" w:type="default"/>
       <w:footerReference r:id="rId10" w:type="default"/>
       <w:pgSz w:h="15840" w:w="12240"/>
-      <w:pgMar w:bottom="576" w:footer="432" w:gutter="0" w:header="432" w:left="720" w:right="720" w:top="576"/>
+      <w:pgMar w:bottom="576" w:footer="576" w:gutter="0" w:header="576" w:left="720" w:right="720" w:top="576"/>
       <w:cols w:space="720"/>
       <w:docGrid w:linePitch="360"/>
     </w:sectPr>
@@ -6191,29 +6191,7 @@
   <w:p>
     <w:pPr>
       <w:spacing w:after="0" w:before="0"/>
-      <w:jc w:val="right"/>
     </w:pPr>
-    <w:r>
-      <w:rPr>
-        <w:color w:val="0077B5"/>
-        <w:sz w:val="15"/>
-      </w:rPr>
-      <w:t>linkedin.com/in/vamshi-singam-82963556</w:t>
-    </w:r>
-    <w:r>
-      <w:rPr>
-        <w:color w:val="BBBBBB"/>
-        <w:sz w:val="14"/>
-      </w:rPr>
-      <w:t xml:space="preserve">  |  </w:t>
-    </w:r>
-    <w:r>
-      <w:rPr>
-        <w:color w:val="333333"/>
-        <w:sz w:val="15"/>
-      </w:rPr>
-      <w:t>github.com/vamshi455</w:t>
-    </w:r>
   </w:p>
 </w:hdr>
 </file>

</xml_diff>

<commit_message>
Clean up repo: remove old docx/history, add LinkedIn+GitHub top-right in body
- Removed all old docx versions (V9, V10, V11), reference.docx, history/
- Removed extra output files (palantir, linkedin)
- LinkedIn and GitHub URLs now top-right aligned with name in document body
- Regenerated master and AWS tailored docx with new layout
- Updated CLAUDE.md to reflect simplified structure

Co-Authored-By: Claude Opus 4.6 (1M context) <noreply@anthropic.com>
</commit_message>
<xml_diff>
--- a/outputs/2026-03-23-aws-platform/Vamshi_Resume_2026_AWS.docx
+++ b/outputs/2026-03-23-aws-platform/Vamshi_Resume_2026_AWS.docx
@@ -21,6 +21,20 @@
           <w:bCs/>
         </w:rPr>
         <w:t xml:space="preserve">Lead Data Engineer | Agentic AI Solutions Architect</w:t>
+      </w:r>
+    </w:p>
+    <w:p>
+      <w:pPr>
+        <w:pStyle w:val="BodyText"/>
+      </w:pPr>
+      <w:r>
+        <w:t xml:space="preserve">linkedin.com/in/vamshi-singam-82963556</w:t>
+      </w:r>
+      <w:r>
+        <w:t xml:space="preserve"> </w:t>
+      </w:r>
+      <w:r>
+        <w:t xml:space="preserve">github.com/vamshi455</w:t>
       </w:r>
     </w:p>
     <w:p>

</xml_diff>

<commit_message>
Make LinkedIn and GitHub URLs clickable hyperlinks in docx output
Co-Authored-By: Claude Opus 4.6 (1M context) <noreply@anthropic.com>
</commit_message>
<xml_diff>
--- a/outputs/2026-03-23-aws-platform/Vamshi_Resume_2026_AWS.docx
+++ b/outputs/2026-03-23-aws-platform/Vamshi_Resume_2026_AWS.docx
@@ -27,15 +27,19 @@
       <w:pPr>
         <w:pStyle w:val="BodyText"/>
       </w:pPr>
-      <w:r>
-        <w:t xml:space="preserve">linkedin.com/in/vamshi-singam-82963556</w:t>
-      </w:r>
-      <w:r>
-        <w:t xml:space="preserve"> </w:t>
-      </w:r>
-      <w:r>
-        <w:t xml:space="preserve">github.com/vamshi455</w:t>
-      </w:r>
+      <w:hyperlink r:id="rId1">
+        <w:r>
+          <w:t xml:space="preserve">linkedin.com/in/vamshi-singam-82963556</w:t>
+        </w:r>
+      </w:hyperlink>
+      <w:r>
+        <w:t xml:space="preserve"> </w:t>
+      </w:r>
+      <w:hyperlink r:id="rId2">
+        <w:r>
+          <w:t xml:space="preserve">github.com/vamshi455</w:t>
+        </w:r>
+      </w:hyperlink>
     </w:p>
     <w:p>
       <w:pPr>
@@ -133,9 +137,11 @@
       <w:r>
         <w:t xml:space="preserve"> </w:t>
       </w:r>
-      <w:r>
-        <w:t xml:space="preserve">GitHub portfolio (github.com/vamshi455) showcasing GenAI and AI</w:t>
-      </w:r>
+      <w:hyperlink r:id="rId2">
+        <w:r>
+          <w:t xml:space="preserve">GitHub portfolio (github.com/vamshi455) showcasing GenAI and AI</w:t>
+        </w:r>
+      </w:hyperlink>
       <w:r>
         <w:t xml:space="preserve"> </w:t>
       </w:r>
@@ -1791,9 +1797,11 @@
       <w:r>
         <w:t xml:space="preserve"> </w:t>
       </w:r>
-      <w:r>
-        <w:t xml:space="preserve">(github.com/vamshi455) with open-source implementations of platform</w:t>
-      </w:r>
+      <w:hyperlink r:id="rId2">
+        <w:r>
+          <w:t xml:space="preserve">(github.com/vamshi455) with open-source implementations of platform</w:t>
+        </w:r>
+      </w:hyperlink>
       <w:r>
         <w:t xml:space="preserve"> </w:t>
       </w:r>

</xml_diff>

<commit_message>
Expand tables to full width, justify paragraphs, add LinkedIn+GitHub hyperlinks
Co-Authored-By: Claude Opus 4.6 (1M context) <noreply@anthropic.com>
</commit_message>
<xml_diff>
--- a/outputs/2026-03-23-aws-platform/Vamshi_Resume_2026_AWS.docx
+++ b/outputs/2026-03-23-aws-platform/Vamshi_Resume_2026_AWS.docx
@@ -14,6 +14,7 @@
     <w:p>
       <w:pPr>
         <w:pStyle w:val="FirstParagraph"/>
+        <w:jc w:val="both"/>
       </w:pPr>
       <w:r>
         <w:rPr>
@@ -26,6 +27,7 @@
     <w:p>
       <w:pPr>
         <w:pStyle w:val="BodyText"/>
+        <w:jc w:val="both"/>
       </w:pPr>
       <w:hyperlink r:id="rId1">
         <w:r>
@@ -44,6 +46,7 @@
     <w:p>
       <w:pPr>
         <w:pStyle w:val="BodyText"/>
+        <w:jc w:val="both"/>
       </w:pPr>
       <w:r>
         <w:rPr>
@@ -59,6 +62,7 @@
           <w:ilvl w:val="0"/>
           <w:numId w:val="1001"/>
         </w:numPr>
+        <w:jc w:val="both"/>
       </w:pPr>
       <w:r>
         <w:t xml:space="preserve">Lead Data Engineer and AI Solutions Architect with 20+ years of</w:t>
@@ -118,6 +122,7 @@
           <w:ilvl w:val="0"/>
           <w:numId w:val="1001"/>
         </w:numPr>
+        <w:jc w:val="both"/>
       </w:pPr>
       <w:r>
         <w:t xml:space="preserve">GenAI/AI Engineering: Building production-grade AI solutions —</w:t>
@@ -161,6 +166,7 @@
           <w:ilvl w:val="0"/>
           <w:numId w:val="1001"/>
         </w:numPr>
+        <w:jc w:val="both"/>
       </w:pPr>
       <w:r>
         <w:t xml:space="preserve">Cloud Platforms &amp; Data Processing: AWS (S3, Glue, Lambda, Redshift,</w:t>
@@ -190,6 +196,7 @@
           <w:ilvl w:val="0"/>
           <w:numId w:val="1001"/>
         </w:numPr>
+        <w:jc w:val="both"/>
       </w:pPr>
       <w:r>
         <w:t xml:space="preserve">Develop highly efficient Batch &amp; Realtime data pipelines for Ingesting</w:t>
@@ -231,6 +238,7 @@
           <w:ilvl w:val="0"/>
           <w:numId w:val="1001"/>
         </w:numPr>
+        <w:jc w:val="both"/>
       </w:pPr>
       <w:r>
         <w:t xml:space="preserve">Programming &amp; Scripting: Python, Scala, JavaScript, C#.Net, SQL</w:t>
@@ -242,6 +250,7 @@
           <w:ilvl w:val="0"/>
           <w:numId w:val="1001"/>
         </w:numPr>
+        <w:jc w:val="both"/>
       </w:pPr>
       <w:r>
         <w:t xml:space="preserve">Database Management: SQL Server, Oracle, PostgreSQL, Amazon Redshift</w:t>
@@ -253,6 +262,7 @@
           <w:ilvl w:val="0"/>
           <w:numId w:val="1001"/>
         </w:numPr>
+        <w:jc w:val="both"/>
       </w:pPr>
       <w:r>
         <w:t xml:space="preserve">Application Development: Throughout career, built custom enterprise</w:t>
@@ -288,6 +298,7 @@
           <w:ilvl w:val="0"/>
           <w:numId w:val="1001"/>
         </w:numPr>
+        <w:jc w:val="both"/>
       </w:pPr>
       <w:r>
         <w:t xml:space="preserve">Data Governance &amp; Security: Implemented PII protection (Dynamic Data</w:t>
@@ -326,6 +337,7 @@
     <w:p>
       <w:pPr>
         <w:pStyle w:val="FirstParagraph"/>
+        <w:jc w:val="both"/>
       </w:pPr>
       <w:r>
         <w:rPr>
@@ -342,6 +354,7 @@
           <w:ilvl w:val="0"/>
           <w:numId w:val="1002"/>
         </w:numPr>
+        <w:jc w:val="both"/>
       </w:pPr>
       <w:r>
         <w:t xml:space="preserve">Extensive experience across Trading, Mobility, Healthcare, Business</w:t>
@@ -356,6 +369,7 @@
     <w:p>
       <w:pPr>
         <w:pStyle w:val="FirstParagraph"/>
+        <w:jc w:val="both"/>
       </w:pPr>
       <w:r>
         <w:rPr>
@@ -372,6 +386,7 @@
           <w:ilvl w:val="0"/>
           <w:numId w:val="1003"/>
         </w:numPr>
+        <w:jc w:val="both"/>
       </w:pPr>
       <w:r>
         <w:t xml:space="preserve">Proven leadership in guiding development and maintenance teams,</w:t>
@@ -392,6 +407,7 @@
     <w:p>
       <w:pPr>
         <w:pStyle w:val="FirstParagraph"/>
+        <w:jc w:val="both"/>
       </w:pPr>
       <w:r>
         <w:rPr>
@@ -404,8 +420,9 @@
     <w:tbl>
       <w:tblPr>
         <w:tblStyle w:val="Table"/>
-        <w:tblW w:type="auto" w:w="0"/>
+        <w:tblW w:type="pct" w:w="5000"/>
         <w:tblLook w:firstRow="1" w:lastRow="0" w:firstColumn="0" w:lastColumn="0" w:noHBand="0" w:noVBand="0" w:val="0020"/>
+        <w:tblLayout w:type="autofit"/>
       </w:tblPr>
       <w:tblGrid>
         <w:gridCol w:w="1320"/>
@@ -1310,6 +1327,7 @@
     <w:p>
       <w:pPr>
         <w:pStyle w:val="BodyText"/>
+        <w:jc w:val="both"/>
       </w:pPr>
       <w:r>
         <w:rPr>
@@ -1326,6 +1344,7 @@
           <w:ilvl w:val="0"/>
           <w:numId w:val="1004"/>
         </w:numPr>
+        <w:jc w:val="both"/>
       </w:pPr>
       <w:r>
         <w:t xml:space="preserve">Foundry &amp; AIP Builder Foundations (Palantir Technologies), Building</w:t>
@@ -1370,6 +1389,7 @@
     <w:p>
       <w:pPr>
         <w:pStyle w:val="FirstParagraph"/>
+        <w:jc w:val="both"/>
       </w:pPr>
       <w:r>
         <w:rPr>
@@ -1385,6 +1405,7 @@
           <w:ilvl w:val="0"/>
           <w:numId w:val="1005"/>
         </w:numPr>
+        <w:jc w:val="both"/>
       </w:pPr>
       <w:r>
         <w:t xml:space="preserve">Bachelor's degree in Electronics &amp; Communication Engineering, India.</w:t>
@@ -1396,6 +1417,7 @@
           <w:ilvl w:val="0"/>
           <w:numId w:val="1005"/>
         </w:numPr>
+        <w:jc w:val="both"/>
       </w:pPr>
       <w:r>
         <w:t xml:space="preserve">Computer Programming in National Institute of Information Technology,</w:t>
@@ -1410,6 +1432,7 @@
     <w:p>
       <w:pPr>
         <w:pStyle w:val="FirstParagraph"/>
+        <w:jc w:val="both"/>
       </w:pPr>
       <w:r>
         <w:rPr>
@@ -1422,6 +1445,7 @@
     <w:p>
       <w:pPr>
         <w:pStyle w:val="BodyText"/>
+        <w:jc w:val="both"/>
       </w:pPr>
       <w:r>
         <w:rPr>
@@ -1448,6 +1472,7 @@
     <w:p>
       <w:pPr>
         <w:pStyle w:val="BodyText"/>
+        <w:jc w:val="both"/>
       </w:pPr>
       <w:r>
         <w:rPr>
@@ -1480,6 +1505,7 @@
     <w:p>
       <w:pPr>
         <w:pStyle w:val="BodyText"/>
+        <w:jc w:val="both"/>
       </w:pPr>
       <w:r>
         <w:rPr>
@@ -1520,6 +1546,7 @@
     <w:p>
       <w:pPr>
         <w:pStyle w:val="BodyText"/>
+        <w:jc w:val="both"/>
       </w:pPr>
       <w:r>
         <w:rPr>
@@ -1532,6 +1559,7 @@
     <w:p>
       <w:pPr>
         <w:pStyle w:val="BodyText"/>
+        <w:jc w:val="both"/>
       </w:pPr>
       <w:r>
         <w:t xml:space="preserve">Architected and delivered an end-to-end Oil &amp; Gas Market Sensing and</w:t>
@@ -1582,6 +1610,7 @@
     <w:p>
       <w:pPr>
         <w:pStyle w:val="BodyText"/>
+        <w:jc w:val="both"/>
       </w:pPr>
       <w:r>
         <w:rPr>
@@ -1597,6 +1626,7 @@
           <w:ilvl w:val="0"/>
           <w:numId w:val="1006"/>
         </w:numPr>
+        <w:jc w:val="both"/>
       </w:pPr>
       <w:r>
         <w:t xml:space="preserve">Integrated Azure AI Foundry as the central AI/ML development and</w:t>
@@ -1632,6 +1662,7 @@
           <w:ilvl w:val="0"/>
           <w:numId w:val="1006"/>
         </w:numPr>
+        <w:jc w:val="both"/>
       </w:pPr>
       <w:r>
         <w:t xml:space="preserve">Designed streaming and batch ingestion using Azure Event Hubs and</w:t>
@@ -1667,6 +1698,7 @@
           <w:ilvl w:val="0"/>
           <w:numId w:val="1006"/>
         </w:numPr>
+        <w:jc w:val="both"/>
       </w:pPr>
       <w:r>
         <w:t xml:space="preserve">Implemented medallion architecture (Bronze → Silver → Gold) on Delta</w:t>
@@ -1708,6 +1740,7 @@
           <w:ilvl w:val="0"/>
           <w:numId w:val="1006"/>
         </w:numPr>
+        <w:jc w:val="both"/>
       </w:pPr>
       <w:r>
         <w:t xml:space="preserve">Built rules-based and ML signal models with risk filters and</w:t>
@@ -1743,6 +1776,7 @@
           <w:ilvl w:val="0"/>
           <w:numId w:val="1006"/>
         </w:numPr>
+        <w:jc w:val="both"/>
       </w:pPr>
       <w:r>
         <w:t xml:space="preserve">Used MLflow (via Azure AI Foundry) for backtesting, P&amp;L attribution,</w:t>
@@ -1778,6 +1812,7 @@
           <w:ilvl w:val="0"/>
           <w:numId w:val="1006"/>
         </w:numPr>
+        <w:jc w:val="both"/>
       </w:pPr>
       <w:r>
         <w:t xml:space="preserve">Defined reference architecture, Responsible AI guardrails, and Agentic</w:t>
@@ -1812,6 +1847,7 @@
     <w:p>
       <w:pPr>
         <w:pStyle w:val="FirstParagraph"/>
+        <w:jc w:val="both"/>
       </w:pPr>
       <w:r>
         <w:rPr>
@@ -1824,6 +1860,7 @@
     <w:p>
       <w:pPr>
         <w:pStyle w:val="BodyText"/>
+        <w:jc w:val="both"/>
       </w:pPr>
       <w:r>
         <w:rPr>
@@ -1842,6 +1879,7 @@
     <w:p>
       <w:pPr>
         <w:pStyle w:val="BodyText"/>
+        <w:jc w:val="both"/>
       </w:pPr>
       <w:r>
         <w:rPr>
@@ -1896,6 +1934,7 @@
     <w:p>
       <w:pPr>
         <w:pStyle w:val="BodyText"/>
+        <w:jc w:val="both"/>
       </w:pPr>
       <w:r>
         <w:rPr>
@@ -1908,6 +1947,7 @@
     <w:p>
       <w:pPr>
         <w:pStyle w:val="BodyText"/>
+        <w:jc w:val="both"/>
       </w:pPr>
       <w:r>
         <w:t xml:space="preserve">Designed and delivered a cloud-native Upstream Data Platform on AWS for</w:t>
@@ -1958,6 +1998,7 @@
     <w:p>
       <w:pPr>
         <w:pStyle w:val="BodyText"/>
+        <w:jc w:val="both"/>
       </w:pPr>
       <w:r>
         <w:rPr>
@@ -1970,6 +2011,7 @@
     <w:p>
       <w:pPr>
         <w:pStyle w:val="BodyText"/>
+        <w:jc w:val="both"/>
       </w:pPr>
       <w:r>
         <w:rPr>
@@ -2012,6 +2054,7 @@
     <w:p>
       <w:pPr>
         <w:pStyle w:val="BodyText"/>
+        <w:jc w:val="both"/>
       </w:pPr>
       <w:r>
         <w:rPr>
@@ -2066,6 +2109,7 @@
     <w:p>
       <w:pPr>
         <w:pStyle w:val="BodyText"/>
+        <w:jc w:val="both"/>
       </w:pPr>
       <w:r>
         <w:rPr>
@@ -2081,6 +2125,7 @@
           <w:ilvl w:val="0"/>
           <w:numId w:val="1007"/>
         </w:numPr>
+        <w:jc w:val="both"/>
       </w:pPr>
       <w:r>
         <w:t xml:space="preserve">Architected and implemented end-to-end VRR data platform on AWS with</w:t>
@@ -2110,6 +2155,7 @@
           <w:ilvl w:val="0"/>
           <w:numId w:val="1007"/>
         </w:numPr>
+        <w:jc w:val="both"/>
       </w:pPr>
       <w:r>
         <w:t xml:space="preserve">Designed AWS S3 data lake architecture with partitioned landing,</w:t>
@@ -2139,6 +2185,7 @@
           <w:ilvl w:val="0"/>
           <w:numId w:val="1007"/>
         </w:numPr>
+        <w:jc w:val="both"/>
       </w:pPr>
       <w:r>
         <w:t xml:space="preserve">Built AWS Glue ETL jobs (PySpark) for field data transformation,</w:t>
@@ -2168,6 +2215,7 @@
           <w:ilvl w:val="0"/>
           <w:numId w:val="1007"/>
         </w:numPr>
+        <w:jc w:val="both"/>
       </w:pPr>
       <w:r>
         <w:t xml:space="preserve">Implemented AWS Lambda functions for event-driven ingestion from</w:t>
@@ -2191,6 +2239,7 @@
           <w:ilvl w:val="0"/>
           <w:numId w:val="1007"/>
         </w:numPr>
+        <w:jc w:val="both"/>
       </w:pPr>
       <w:r>
         <w:t xml:space="preserve">Orchestrated end-to-end pipeline execution using AWS Step Functions</w:t>
@@ -2220,6 +2269,7 @@
           <w:ilvl w:val="0"/>
           <w:numId w:val="1007"/>
         </w:numPr>
+        <w:jc w:val="both"/>
       </w:pPr>
       <w:r>
         <w:t xml:space="preserve">Developed dbt models on Snowflake to compute instantaneous VRR</w:t>
@@ -2255,6 +2305,7 @@
           <w:ilvl w:val="0"/>
           <w:numId w:val="1007"/>
         </w:numPr>
+        <w:jc w:val="both"/>
       </w:pPr>
       <w:r>
         <w:t xml:space="preserve">Configured AWS CloudWatch dashboards and alarms for pipeline health</w:t>
@@ -2284,6 +2335,7 @@
           <w:ilvl w:val="0"/>
           <w:numId w:val="1007"/>
         </w:numPr>
+        <w:jc w:val="both"/>
       </w:pPr>
       <w:r>
         <w:t xml:space="preserve">Implemented AWS IAM policies and Lake Formation permissions for</w:t>
@@ -2307,6 +2359,7 @@
           <w:ilvl w:val="0"/>
           <w:numId w:val="1007"/>
         </w:numPr>
+        <w:jc w:val="both"/>
       </w:pPr>
       <w:r>
         <w:t xml:space="preserve">Implemented PySpark on Databricks for processing high-volume</w:t>
@@ -2330,6 +2383,7 @@
           <w:ilvl w:val="0"/>
           <w:numId w:val="1007"/>
         </w:numPr>
+        <w:jc w:val="both"/>
       </w:pPr>
       <w:r>
         <w:t xml:space="preserve">Developed Power BI dashboards surfacing real-time VRR metrics,</w:t>
@@ -2359,6 +2413,7 @@
           <w:ilvl w:val="0"/>
           <w:numId w:val="1007"/>
         </w:numPr>
+        <w:jc w:val="both"/>
       </w:pPr>
       <w:r>
         <w:t xml:space="preserve">Reduced VRR calculation time from hours to minutes through optimized</w:t>
@@ -2388,6 +2443,7 @@
           <w:ilvl w:val="0"/>
           <w:numId w:val="1007"/>
         </w:numPr>
+        <w:jc w:val="both"/>
       </w:pPr>
       <w:r>
         <w:t xml:space="preserve">Built interactive Streamlit application for reservoir engineers to</w:t>
@@ -2414,6 +2470,7 @@
     <w:p>
       <w:pPr>
         <w:pStyle w:val="FirstParagraph"/>
+        <w:jc w:val="both"/>
       </w:pPr>
       <w:r>
         <w:rPr>
@@ -2454,6 +2511,7 @@
     <w:p>
       <w:pPr>
         <w:pStyle w:val="BodyText"/>
+        <w:jc w:val="both"/>
       </w:pPr>
       <w:r>
         <w:rPr>
@@ -2494,6 +2552,7 @@
     <w:p>
       <w:pPr>
         <w:pStyle w:val="BodyText"/>
+        <w:jc w:val="both"/>
       </w:pPr>
       <w:r>
         <w:rPr>
@@ -2506,6 +2565,7 @@
     <w:p>
       <w:pPr>
         <w:pStyle w:val="BodyText"/>
+        <w:jc w:val="both"/>
       </w:pPr>
       <w:r>
         <w:t xml:space="preserve">Efficient Data Extraction: Extract loyalty program data from vendor</w:t>
@@ -2532,6 +2592,7 @@
     <w:p>
       <w:pPr>
         <w:pStyle w:val="BodyText"/>
+        <w:jc w:val="both"/>
       </w:pPr>
       <w:r>
         <w:t xml:space="preserve">Scalable Data Processing: Azure Synapse Analytics deployed to handle</w:t>
@@ -2558,6 +2619,7 @@
     <w:p>
       <w:pPr>
         <w:pStyle w:val="BodyText"/>
+        <w:jc w:val="both"/>
       </w:pPr>
       <w:r>
         <w:t xml:space="preserve">Data Transformation and Enrichment: Implemented medallion architecture</w:t>
@@ -2590,6 +2652,7 @@
     <w:p>
       <w:pPr>
         <w:pStyle w:val="BodyText"/>
+        <w:jc w:val="both"/>
       </w:pPr>
       <w:r>
         <w:t xml:space="preserve">POS Reporting and Analytics Enablement: Platform enables retail POS</w:t>
@@ -2622,6 +2685,7 @@
     <w:p>
       <w:pPr>
         <w:pStyle w:val="BodyText"/>
+        <w:jc w:val="both"/>
       </w:pPr>
       <w:r>
         <w:t xml:space="preserve">My Roles and Responsibilities:</w:t>
@@ -2633,6 +2697,7 @@
           <w:ilvl w:val="0"/>
           <w:numId w:val="1008"/>
         </w:numPr>
+        <w:jc w:val="both"/>
       </w:pPr>
       <w:r>
         <w:t xml:space="preserve">Architected and developed end-to-end data ingestion solution</w:t>
@@ -2656,6 +2721,7 @@
           <w:ilvl w:val="0"/>
           <w:numId w:val="1008"/>
         </w:numPr>
+        <w:jc w:val="both"/>
       </w:pPr>
       <w:r>
         <w:t xml:space="preserve">Designed master orchestration pipeline with intelligent routing</w:t>
@@ -2679,6 +2745,7 @@
           <w:ilvl w:val="0"/>
           <w:numId w:val="1008"/>
         </w:numPr>
+        <w:jc w:val="both"/>
       </w:pPr>
       <w:r>
         <w:t xml:space="preserve">Built SFTP ingestion framework implementing watermark-based change</w:t>
@@ -2696,6 +2763,7 @@
           <w:ilvl w:val="0"/>
           <w:numId w:val="1008"/>
         </w:numPr>
+        <w:jc w:val="both"/>
       </w:pPr>
       <w:r>
         <w:t xml:space="preserve">Developed PySpark processing notebooks with predefined schemas for all</w:t>
@@ -2713,6 +2781,7 @@
           <w:ilvl w:val="0"/>
           <w:numId w:val="1008"/>
         </w:numPr>
+        <w:jc w:val="both"/>
       </w:pPr>
       <w:r>
         <w:t xml:space="preserve">Implemented stored procedures for merge operations across replica,</w:t>
@@ -2730,6 +2799,7 @@
           <w:ilvl w:val="0"/>
           <w:numId w:val="1008"/>
         </w:numPr>
+        <w:jc w:val="both"/>
       </w:pPr>
       <w:r>
         <w:t xml:space="preserve">Optimized data processing performance by converting MERGE operations</w:t>
@@ -2753,6 +2823,7 @@
           <w:ilvl w:val="0"/>
           <w:numId w:val="1008"/>
         </w:numPr>
+        <w:jc w:val="both"/>
       </w:pPr>
       <w:r>
         <w:t xml:space="preserve">Configured Synapse Spark Pool with dynamic allocation and external</w:t>
@@ -2770,6 +2841,7 @@
           <w:ilvl w:val="0"/>
           <w:numId w:val="1008"/>
         </w:numPr>
+        <w:jc w:val="both"/>
       </w:pPr>
       <w:r>
         <w:t xml:space="preserve">Architected ADLS container structure following medallion pattern with</w:t>
@@ -2787,6 +2859,7 @@
           <w:ilvl w:val="0"/>
           <w:numId w:val="1008"/>
         </w:numPr>
+        <w:jc w:val="both"/>
       </w:pPr>
       <w:r>
         <w:t xml:space="preserve">Implemented data governance and PII protection controls for customer</w:t>
@@ -2822,6 +2895,7 @@
           <w:ilvl w:val="0"/>
           <w:numId w:val="1008"/>
         </w:numPr>
+        <w:jc w:val="both"/>
       </w:pPr>
       <w:r>
         <w:t xml:space="preserve">Deployed solution across Dev, QA, and Prod environments with</w:t>
@@ -2839,6 +2913,7 @@
           <w:ilvl w:val="0"/>
           <w:numId w:val="1008"/>
         </w:numPr>
+        <w:jc w:val="both"/>
       </w:pPr>
       <w:r>
         <w:t xml:space="preserve">Collaborated with business stakeholders to understand loyalty</w:t>
@@ -2859,6 +2934,7 @@
     <w:p>
       <w:pPr>
         <w:pStyle w:val="FirstParagraph"/>
+        <w:jc w:val="both"/>
       </w:pPr>
       <w:r>
         <w:rPr>
@@ -2885,6 +2961,7 @@
     <w:p>
       <w:pPr>
         <w:pStyle w:val="BodyText"/>
+        <w:jc w:val="both"/>
       </w:pPr>
       <w:r>
         <w:rPr>
@@ -2903,6 +2980,7 @@
     <w:p>
       <w:pPr>
         <w:pStyle w:val="BodyText"/>
+        <w:jc w:val="both"/>
       </w:pPr>
       <w:r>
         <w:rPr>
@@ -2943,6 +3021,7 @@
     <w:p>
       <w:pPr>
         <w:pStyle w:val="BodyText"/>
+        <w:jc w:val="both"/>
       </w:pPr>
       <w:r>
         <w:rPr>
@@ -2955,6 +3034,7 @@
     <w:p>
       <w:pPr>
         <w:pStyle w:val="BodyText"/>
+        <w:jc w:val="both"/>
       </w:pPr>
       <w:r>
         <w:t xml:space="preserve">Engineered end-to-end data migration pipelines to modernize a legacy</w:t>
@@ -2987,6 +3067,7 @@
     <w:p>
       <w:pPr>
         <w:pStyle w:val="BodyText"/>
+        <w:jc w:val="both"/>
       </w:pPr>
       <w:r>
         <w:rPr>
@@ -3002,6 +3083,7 @@
           <w:ilvl w:val="0"/>
           <w:numId w:val="1009"/>
         </w:numPr>
+        <w:jc w:val="both"/>
       </w:pPr>
       <w:r>
         <w:t xml:space="preserve">Designed and implemented Qlik Replication jobs for CDC-based ingestion</w:t>
@@ -3031,6 +3113,7 @@
           <w:ilvl w:val="0"/>
           <w:numId w:val="1009"/>
         </w:numPr>
+        <w:jc w:val="both"/>
       </w:pPr>
       <w:r>
         <w:t xml:space="preserve">Built MERGE-based upsert stored procedures (T-SQL) for complex</w:t>
@@ -3054,6 +3137,7 @@
           <w:ilvl w:val="0"/>
           <w:numId w:val="1009"/>
         </w:numPr>
+        <w:jc w:val="both"/>
       </w:pPr>
       <w:r>
         <w:t xml:space="preserve">Architected parent-child pipeline patterns with concurrency guards, runtime</w:t>
@@ -3077,6 +3161,7 @@
           <w:ilvl w:val="0"/>
           <w:numId w:val="1009"/>
         </w:numPr>
+        <w:jc w:val="both"/>
       </w:pPr>
       <w:r>
         <w:t xml:space="preserve">Implemented watermark persistence framework tracking high/low</w:t>
@@ -3100,6 +3185,7 @@
           <w:ilvl w:val="0"/>
           <w:numId w:val="1009"/>
         </w:numPr>
+        <w:jc w:val="both"/>
       </w:pPr>
       <w:r>
         <w:t xml:space="preserve">Integrated Azure Log Analytics for pipeline monitoring and error</w:t>
@@ -3123,6 +3209,7 @@
           <w:ilvl w:val="0"/>
           <w:numId w:val="1009"/>
         </w:numPr>
+        <w:jc w:val="both"/>
       </w:pPr>
       <w:r>
         <w:t xml:space="preserve">Built Power BI reporting layer on the curated schema delivering</w:t>
@@ -3152,6 +3239,7 @@
           <w:ilvl w:val="0"/>
           <w:numId w:val="1009"/>
         </w:numPr>
+        <w:jc w:val="both"/>
       </w:pPr>
       <w:r>
         <w:t xml:space="preserve">Developed Crude Deal Capture Reporting module delivering P&amp;L reports,</w:t>
@@ -3184,6 +3272,7 @@
     <w:p>
       <w:pPr>
         <w:pStyle w:val="FirstParagraph"/>
+        <w:jc w:val="both"/>
       </w:pPr>
       <w:r>
         <w:rPr>
@@ -3210,6 +3299,7 @@
     <w:p>
       <w:pPr>
         <w:pStyle w:val="BodyText"/>
+        <w:jc w:val="both"/>
       </w:pPr>
       <w:r>
         <w:rPr>
@@ -3228,6 +3318,7 @@
     <w:p>
       <w:pPr>
         <w:pStyle w:val="BodyText"/>
+        <w:jc w:val="both"/>
       </w:pPr>
       <w:r>
         <w:rPr>
@@ -3254,6 +3345,7 @@
     <w:p>
       <w:pPr>
         <w:pStyle w:val="BodyText"/>
+        <w:jc w:val="both"/>
       </w:pPr>
       <w:r>
         <w:rPr>
@@ -3266,6 +3358,7 @@
     <w:p>
       <w:pPr>
         <w:pStyle w:val="BodyText"/>
+        <w:jc w:val="both"/>
       </w:pPr>
       <w:r>
         <w:t xml:space="preserve">Led data platform modernization for Marathon Petroleum's SAP Enterprise</w:t>
@@ -3304,6 +3397,7 @@
     <w:p>
       <w:pPr>
         <w:pStyle w:val="BodyText"/>
+        <w:jc w:val="both"/>
       </w:pPr>
       <w:r>
         <w:rPr>
@@ -3319,6 +3413,7 @@
           <w:ilvl w:val="0"/>
           <w:numId w:val="1010"/>
         </w:numPr>
+        <w:jc w:val="both"/>
       </w:pPr>
       <w:r>
         <w:t xml:space="preserve">Provided technical leadership and guidance to the data engineering</w:t>
@@ -3342,6 +3437,7 @@
           <w:ilvl w:val="0"/>
           <w:numId w:val="1010"/>
         </w:numPr>
+        <w:jc w:val="both"/>
       </w:pPr>
       <w:r>
         <w:t xml:space="preserve">Designed and implemented data ingestion pipelines to extract data from</w:t>
@@ -3365,6 +3461,7 @@
           <w:ilvl w:val="0"/>
           <w:numId w:val="1010"/>
         </w:numPr>
+        <w:jc w:val="both"/>
       </w:pPr>
       <w:r>
         <w:t xml:space="preserve">Developed data processing workflows using Databricks and ADF to</w:t>
@@ -3388,6 +3485,7 @@
           <w:ilvl w:val="0"/>
           <w:numId w:val="1010"/>
         </w:numPr>
+        <w:jc w:val="both"/>
       </w:pPr>
       <w:r>
         <w:t xml:space="preserve">Implemented data security models and governance controls ensuring</w:t>
@@ -3405,6 +3503,7 @@
           <w:ilvl w:val="0"/>
           <w:numId w:val="1010"/>
         </w:numPr>
+        <w:jc w:val="both"/>
       </w:pPr>
       <w:r>
         <w:t xml:space="preserve">Designed and maintained data architecture including data models, schema</w:t>
@@ -3428,6 +3527,7 @@
           <w:ilvl w:val="0"/>
           <w:numId w:val="1010"/>
         </w:numPr>
+        <w:jc w:val="both"/>
       </w:pPr>
       <w:r>
         <w:t xml:space="preserve">Optimized ETL pipeline performance by identifying and resolving</w:t>
@@ -3451,6 +3551,7 @@
           <w:ilvl w:val="0"/>
           <w:numId w:val="1010"/>
         </w:numPr>
+        <w:jc w:val="both"/>
       </w:pPr>
       <w:r>
         <w:t xml:space="preserve">Built dbt (Data Build Tools) and Fivetran pipelines as the standard</w:t>
@@ -3474,6 +3575,7 @@
           <w:ilvl w:val="0"/>
           <w:numId w:val="1010"/>
         </w:numPr>
+        <w:jc w:val="both"/>
       </w:pPr>
       <w:r>
         <w:t xml:space="preserve">Maintained comprehensive documentation and fostered knowledge sharing</w:t>
@@ -3488,6 +3590,7 @@
     <w:p>
       <w:pPr>
         <w:pStyle w:val="FirstParagraph"/>
+        <w:jc w:val="both"/>
       </w:pPr>
       <w:r>
         <w:rPr>
@@ -3514,6 +3617,7 @@
     <w:p>
       <w:pPr>
         <w:pStyle w:val="BodyText"/>
+        <w:jc w:val="both"/>
       </w:pPr>
       <w:r>
         <w:rPr>
@@ -3546,6 +3650,7 @@
     <w:p>
       <w:pPr>
         <w:pStyle w:val="BodyText"/>
+        <w:jc w:val="both"/>
       </w:pPr>
       <w:r>
         <w:rPr>
@@ -3586,6 +3691,7 @@
     <w:p>
       <w:pPr>
         <w:pStyle w:val="BodyText"/>
+        <w:jc w:val="both"/>
       </w:pPr>
       <w:r>
         <w:rPr>
@@ -3598,6 +3704,7 @@
     <w:p>
       <w:pPr>
         <w:pStyle w:val="BodyText"/>
+        <w:jc w:val="both"/>
       </w:pPr>
       <w:r>
         <w:t xml:space="preserve">Shell Americas Retail requires trusted data for business to quickly make</w:t>
@@ -3639,6 +3746,7 @@
           <w:ilvl w:val="0"/>
           <w:numId w:val="1011"/>
         </w:numPr>
+        <w:jc w:val="both"/>
       </w:pPr>
       <w:r>
         <w:t xml:space="preserve">Data Ingestion – Connect to all source systems (All Retail OLTP</w:t>
@@ -3656,6 +3764,7 @@
           <w:ilvl w:val="0"/>
           <w:numId w:val="1011"/>
         </w:numPr>
+        <w:jc w:val="both"/>
       </w:pPr>
       <w:r>
         <w:t xml:space="preserve">Data Curation – Understanding business logics and applying</w:t>
@@ -3673,6 +3782,7 @@
           <w:ilvl w:val="0"/>
           <w:numId w:val="1011"/>
         </w:numPr>
+        <w:jc w:val="both"/>
       </w:pPr>
       <w:r>
         <w:t xml:space="preserve">Data Governance – Implementing various controls on the sensitive</w:t>
@@ -3690,6 +3800,7 @@
           <w:ilvl w:val="0"/>
           <w:numId w:val="1011"/>
         </w:numPr>
+        <w:jc w:val="both"/>
       </w:pPr>
       <w:r>
         <w:t xml:space="preserve">Visualization – Design and Develop Power bi Dashboard &amp; Reports</w:t>
@@ -3701,6 +3812,7 @@
           <w:ilvl w:val="0"/>
           <w:numId w:val="1000"/>
         </w:numPr>
+        <w:jc w:val="both"/>
       </w:pPr>
       <w:r>
         <w:rPr>
@@ -3716,6 +3828,7 @@
           <w:ilvl w:val="0"/>
           <w:numId w:val="1012"/>
         </w:numPr>
+        <w:jc w:val="both"/>
       </w:pPr>
       <w:r>
         <w:t xml:space="preserve">Design &amp; Develop Ingestion module, process files into staging layer for</w:t>
@@ -3733,6 +3846,7 @@
           <w:ilvl w:val="0"/>
           <w:numId w:val="1012"/>
         </w:numPr>
+        <w:jc w:val="both"/>
       </w:pPr>
       <w:r>
         <w:t xml:space="preserve">Design &amp; Develop Databricks notebooks to process the source files –</w:t>
@@ -3750,6 +3864,7 @@
           <w:ilvl w:val="0"/>
           <w:numId w:val="1012"/>
         </w:numPr>
+        <w:jc w:val="both"/>
       </w:pPr>
       <w:r>
         <w:t xml:space="preserve">Implemented comprehensive data governance for Fuel Rewards customer</w:t>
@@ -3785,6 +3900,7 @@
           <w:ilvl w:val="0"/>
           <w:numId w:val="1012"/>
         </w:numPr>
+        <w:jc w:val="both"/>
       </w:pPr>
       <w:r>
         <w:t xml:space="preserve">Design &amp; Develop ADF pipelines for orchestrating the Databricks</w:t>
@@ -3802,6 +3918,7 @@
           <w:ilvl w:val="0"/>
           <w:numId w:val="1012"/>
         </w:numPr>
+        <w:jc w:val="both"/>
       </w:pPr>
       <w:r>
         <w:t xml:space="preserve">Parallelly process ingress files and process them into staging layer for curation</w:t>
@@ -3813,6 +3930,7 @@
           <w:ilvl w:val="0"/>
           <w:numId w:val="1012"/>
         </w:numPr>
+        <w:jc w:val="both"/>
       </w:pPr>
       <w:r>
         <w:t xml:space="preserve">Design &amp; Develop DB Notebooks to automate SCD Type 2 process.</w:t>
@@ -3824,6 +3942,7 @@
           <w:ilvl w:val="0"/>
           <w:numId w:val="1012"/>
         </w:numPr>
+        <w:jc w:val="both"/>
       </w:pPr>
       <w:r>
         <w:t xml:space="preserve">Design &amp; Develop Data Security for PII (Personally Identifiable</w:t>
@@ -3841,6 +3960,7 @@
           <w:ilvl w:val="0"/>
           <w:numId w:val="1012"/>
         </w:numPr>
+        <w:jc w:val="both"/>
       </w:pPr>
       <w:r>
         <w:t xml:space="preserve">Design and Develop CI/CD for ADF, Azure Databricks and Web Interface</w:t>
@@ -3849,6 +3969,7 @@
     <w:p>
       <w:pPr>
         <w:pStyle w:val="FirstParagraph"/>
+        <w:jc w:val="both"/>
       </w:pPr>
       <w:r>
         <w:rPr>
@@ -3875,6 +3996,7 @@
     <w:p>
       <w:pPr>
         <w:pStyle w:val="BodyText"/>
+        <w:jc w:val="both"/>
       </w:pPr>
       <w:r>
         <w:rPr>
@@ -3893,6 +4015,7 @@
     <w:p>
       <w:pPr>
         <w:pStyle w:val="BodyText"/>
+        <w:jc w:val="both"/>
       </w:pPr>
       <w:r>
         <w:rPr>
@@ -3933,6 +4056,7 @@
     <w:p>
       <w:pPr>
         <w:pStyle w:val="BodyText"/>
+        <w:jc w:val="both"/>
       </w:pPr>
       <w:r>
         <w:rPr>
@@ -3945,6 +4069,7 @@
     <w:p>
       <w:pPr>
         <w:pStyle w:val="BodyText"/>
+        <w:jc w:val="both"/>
       </w:pPr>
       <w:r>
         <w:t xml:space="preserve">Built an enterprise data lake platform for natural gas and power</w:t>
@@ -3974,6 +4099,7 @@
           <w:ilvl w:val="0"/>
           <w:numId w:val="1013"/>
         </w:numPr>
+        <w:jc w:val="both"/>
       </w:pPr>
       <w:r>
         <w:t xml:space="preserve">Data Ingestion – from all enterprise and external data sources</w:t>
@@ -3985,6 +4111,7 @@
           <w:ilvl w:val="0"/>
           <w:numId w:val="1013"/>
         </w:numPr>
+        <w:jc w:val="both"/>
       </w:pPr>
       <w:r>
         <w:t xml:space="preserve">Data Synchronization – SCD (Types) to keep data synchronized with</w:t>
@@ -4002,6 +4129,7 @@
           <w:ilvl w:val="0"/>
           <w:numId w:val="1013"/>
         </w:numPr>
+        <w:jc w:val="both"/>
       </w:pPr>
       <w:r>
         <w:t xml:space="preserve">Data Governance – cataloging, data lineage, metadata management,</w:t>
@@ -4019,6 +4147,7 @@
           <w:ilvl w:val="0"/>
           <w:numId w:val="1013"/>
         </w:numPr>
+        <w:jc w:val="both"/>
       </w:pPr>
       <w:r>
         <w:t xml:space="preserve">Configuration Management – Web UI to manage configurations</w:t>
@@ -4036,6 +4165,7 @@
           <w:ilvl w:val="0"/>
           <w:numId w:val="1000"/>
         </w:numPr>
+        <w:jc w:val="both"/>
       </w:pPr>
       <w:r>
         <w:rPr>
@@ -4051,6 +4181,7 @@
           <w:ilvl w:val="0"/>
           <w:numId w:val="1014"/>
         </w:numPr>
+        <w:jc w:val="both"/>
       </w:pPr>
       <w:r>
         <w:t xml:space="preserve">Draft the requirements and solutioning the project.</w:t>
@@ -4062,6 +4193,7 @@
           <w:ilvl w:val="0"/>
           <w:numId w:val="1014"/>
         </w:numPr>
+        <w:jc w:val="both"/>
       </w:pPr>
       <w:r>
         <w:t xml:space="preserve">Create Databricks notebooks to ingest the source files.</w:t>
@@ -4073,6 +4205,7 @@
           <w:ilvl w:val="0"/>
           <w:numId w:val="1014"/>
         </w:numPr>
+        <w:jc w:val="both"/>
       </w:pPr>
       <w:r>
         <w:t xml:space="preserve">Design &amp; Develop ADF pipelines for orchestrating the Databricks</w:t>
@@ -4090,6 +4223,7 @@
           <w:ilvl w:val="0"/>
           <w:numId w:val="1014"/>
         </w:numPr>
+        <w:jc w:val="both"/>
       </w:pPr>
       <w:r>
         <w:t xml:space="preserve">Design &amp; Develop DB Notebooks to automate SCD Type 2 Dimension</w:t>
@@ -4107,6 +4241,7 @@
           <w:ilvl w:val="0"/>
           <w:numId w:val="1014"/>
         </w:numPr>
+        <w:jc w:val="both"/>
       </w:pPr>
       <w:r>
         <w:t xml:space="preserve">Design Folders structure in ADLS file system to hold the data files.</w:t>
@@ -4118,6 +4253,7 @@
           <w:ilvl w:val="0"/>
           <w:numId w:val="1014"/>
         </w:numPr>
+        <w:jc w:val="both"/>
       </w:pPr>
       <w:r>
         <w:t xml:space="preserve">Architect and develop Web Interface for configuration management and</w:t>
@@ -4135,6 +4271,7 @@
           <w:ilvl w:val="0"/>
           <w:numId w:val="1014"/>
         </w:numPr>
+        <w:jc w:val="both"/>
       </w:pPr>
       <w:r>
         <w:t xml:space="preserve">Design and Develop CI/CD for ADF, Azure Databricks and Web Interface</w:t>
@@ -4146,6 +4283,7 @@
           <w:ilvl w:val="0"/>
           <w:numId w:val="1014"/>
         </w:numPr>
+        <w:jc w:val="both"/>
       </w:pPr>
       <w:r>
         <w:t xml:space="preserve">Migrate business logic from PL/SQL logic to Azure Synapse Analytics</w:t>
@@ -4154,6 +4292,7 @@
     <w:p>
       <w:pPr>
         <w:pStyle w:val="FirstParagraph"/>
+        <w:jc w:val="both"/>
       </w:pPr>
       <w:r>
         <w:rPr>
@@ -4166,6 +4305,7 @@
     <w:p>
       <w:pPr>
         <w:pStyle w:val="BodyText"/>
+        <w:jc w:val="both"/>
       </w:pPr>
       <w:r>
         <w:rPr>
@@ -4198,6 +4338,7 @@
     <w:p>
       <w:pPr>
         <w:pStyle w:val="BodyText"/>
+        <w:jc w:val="both"/>
       </w:pPr>
       <w:r>
         <w:rPr>
@@ -4224,6 +4365,7 @@
     <w:p>
       <w:pPr>
         <w:pStyle w:val="BodyText"/>
+        <w:jc w:val="both"/>
       </w:pPr>
       <w:r>
         <w:rPr>
@@ -4236,6 +4378,7 @@
     <w:p>
       <w:pPr>
         <w:pStyle w:val="BodyText"/>
+        <w:jc w:val="both"/>
       </w:pPr>
       <w:r>
         <w:t xml:space="preserve">Built a value chain supply optimization platform for daily use by</w:t>
@@ -4274,6 +4417,7 @@
     <w:p>
       <w:pPr>
         <w:pStyle w:val="BodyText"/>
+        <w:jc w:val="both"/>
       </w:pPr>
       <w:r>
         <w:rPr>
@@ -4289,6 +4433,7 @@
           <w:ilvl w:val="0"/>
           <w:numId w:val="1015"/>
         </w:numPr>
+        <w:jc w:val="both"/>
       </w:pPr>
       <w:r>
         <w:t xml:space="preserve">Conducting user interviews with Data Analysts and getting the user</w:t>
@@ -4306,6 +4451,7 @@
           <w:ilvl w:val="0"/>
           <w:numId w:val="1015"/>
         </w:numPr>
+        <w:jc w:val="both"/>
       </w:pPr>
       <w:r>
         <w:t xml:space="preserve">Drafting/Finalizing the requirements based on the user needs and</w:t>
@@ -4323,6 +4469,7 @@
           <w:ilvl w:val="0"/>
           <w:numId w:val="1015"/>
         </w:numPr>
+        <w:jc w:val="both"/>
       </w:pPr>
       <w:r>
         <w:t xml:space="preserve">Design, Develop Azure Databricks Notebooks for data curation.</w:t>
@@ -4334,6 +4481,7 @@
           <w:ilvl w:val="0"/>
           <w:numId w:val="1015"/>
         </w:numPr>
+        <w:jc w:val="both"/>
       </w:pPr>
       <w:r>
         <w:t xml:space="preserve">Create Custom Notebook Scoped Python libraries and make generic usage</w:t>
@@ -4357,6 +4505,7 @@
           <w:ilvl w:val="0"/>
           <w:numId w:val="1015"/>
         </w:numPr>
+        <w:jc w:val="both"/>
       </w:pPr>
       <w:r>
         <w:t xml:space="preserve">Ingest data from different type of Data Sources and schedule them on</w:t>
@@ -4374,6 +4523,7 @@
           <w:ilvl w:val="0"/>
           <w:numId w:val="1015"/>
         </w:numPr>
+        <w:jc w:val="both"/>
       </w:pPr>
       <w:r>
         <w:t xml:space="preserve">Integrate data from other system APIs using MuleSoft.</w:t>
@@ -4385,6 +4535,7 @@
           <w:ilvl w:val="0"/>
           <w:numId w:val="1015"/>
         </w:numPr>
+        <w:jc w:val="both"/>
       </w:pPr>
       <w:r>
         <w:t xml:space="preserve">Designing Bronze, Silver and Gold level standard staging in ADLS</w:t>
@@ -4402,6 +4553,7 @@
           <w:ilvl w:val="0"/>
           <w:numId w:val="1015"/>
         </w:numPr>
+        <w:jc w:val="both"/>
       </w:pPr>
       <w:r>
         <w:t xml:space="preserve">Design, develop dimensional model in MPP using Azure Synapse Analytics</w:t>
@@ -4419,6 +4571,7 @@
           <w:ilvl w:val="0"/>
           <w:numId w:val="1015"/>
         </w:numPr>
+        <w:jc w:val="both"/>
       </w:pPr>
       <w:r>
         <w:t xml:space="preserve">Orchestrate Data Flows with Azure Data Factory</w:t>
@@ -4430,6 +4583,7 @@
           <w:ilvl w:val="0"/>
           <w:numId w:val="1015"/>
         </w:numPr>
+        <w:jc w:val="both"/>
       </w:pPr>
       <w:r>
         <w:t xml:space="preserve">Storing data in Data Lake using Delta Lake Storage format and leverage</w:t>
@@ -4447,6 +4601,7 @@
           <w:ilvl w:val="0"/>
           <w:numId w:val="1015"/>
         </w:numPr>
+        <w:jc w:val="both"/>
       </w:pPr>
       <w:r>
         <w:t xml:space="preserve">Implementing Slowly Changing Dimensions for historical tracking in</w:t>
@@ -4464,6 +4619,7 @@
           <w:ilvl w:val="0"/>
           <w:numId w:val="1015"/>
         </w:numPr>
+        <w:jc w:val="both"/>
       </w:pPr>
       <w:r>
         <w:t xml:space="preserve">Develop Databricks notebooks to evaluate Formulas and store data in</w:t>
@@ -4481,6 +4637,7 @@
           <w:ilvl w:val="0"/>
           <w:numId w:val="1015"/>
         </w:numPr>
+        <w:jc w:val="both"/>
       </w:pPr>
       <w:r>
         <w:t xml:space="preserve">Develop ADF Pipelines Templates for replicating data from JSON,</w:t>
@@ -4498,6 +4655,7 @@
           <w:ilvl w:val="0"/>
           <w:numId w:val="1015"/>
         </w:numPr>
+        <w:jc w:val="both"/>
       </w:pPr>
       <w:r>
         <w:t xml:space="preserve">Build CI &amp; CD Pipelines for Azure Databricks, Azure Data Factory and</w:t>
@@ -4515,6 +4673,7 @@
           <w:ilvl w:val="0"/>
           <w:numId w:val="1015"/>
         </w:numPr>
+        <w:jc w:val="both"/>
       </w:pPr>
       <w:r>
         <w:t xml:space="preserve">Design develop UX design for few master data managements using .NET</w:t>
@@ -4532,6 +4691,7 @@
           <w:ilvl w:val="0"/>
           <w:numId w:val="1015"/>
         </w:numPr>
+        <w:jc w:val="both"/>
       </w:pPr>
       <w:r>
         <w:t xml:space="preserve">Integrate traditional SSIS Packages with ADF pipelines.</w:t>
@@ -4540,6 +4700,7 @@
     <w:p>
       <w:pPr>
         <w:pStyle w:val="FirstParagraph"/>
+        <w:jc w:val="both"/>
       </w:pPr>
       <w:r>
         <w:rPr>
@@ -4574,6 +4735,7 @@
     <w:p>
       <w:pPr>
         <w:pStyle w:val="BodyText"/>
+        <w:jc w:val="both"/>
       </w:pPr>
       <w:r>
         <w:rPr>
@@ -4592,6 +4754,7 @@
     <w:p>
       <w:pPr>
         <w:pStyle w:val="BodyText"/>
+        <w:jc w:val="both"/>
       </w:pPr>
       <w:r>
         <w:rPr>
@@ -4632,6 +4795,7 @@
     <w:p>
       <w:pPr>
         <w:pStyle w:val="BodyText"/>
+        <w:jc w:val="both"/>
       </w:pPr>
       <w:r>
         <w:rPr>
@@ -4650,6 +4814,7 @@
     <w:p>
       <w:pPr>
         <w:pStyle w:val="BodyText"/>
+        <w:jc w:val="both"/>
       </w:pPr>
       <w:r>
         <w:rPr>
@@ -4668,6 +4833,7 @@
     <w:p>
       <w:pPr>
         <w:pStyle w:val="BodyText"/>
+        <w:jc w:val="both"/>
       </w:pPr>
       <w:r>
         <w:rPr>
@@ -4680,6 +4846,7 @@
     <w:p>
       <w:pPr>
         <w:pStyle w:val="BodyText"/>
+        <w:jc w:val="both"/>
       </w:pPr>
       <w:r>
         <w:t xml:space="preserve">Migrated an on-premises net revenue analytics dataset from SQL Server</w:t>
@@ -4703,6 +4870,7 @@
           <w:ilvl w:val="0"/>
           <w:numId w:val="1016"/>
         </w:numPr>
+        <w:jc w:val="both"/>
       </w:pPr>
       <w:r>
         <w:t xml:space="preserve">Design &amp; Develop migration strategy for the existing dataset</w:t>
@@ -4726,6 +4894,7 @@
           <w:ilvl w:val="0"/>
           <w:numId w:val="1016"/>
         </w:numPr>
+        <w:jc w:val="both"/>
       </w:pPr>
       <w:r>
         <w:t xml:space="preserve">Design &amp; Develop batch processing solutions by using Data Factory and</w:t>
@@ -4743,6 +4912,7 @@
           <w:ilvl w:val="0"/>
           <w:numId w:val="1016"/>
         </w:numPr>
+        <w:jc w:val="both"/>
       </w:pPr>
       <w:r>
         <w:t xml:space="preserve">Refactoring &amp; migrating existing staging on premises data load (SSIS &amp;</w:t>
@@ -4760,6 +4930,7 @@
           <w:ilvl w:val="0"/>
           <w:numId w:val="1016"/>
         </w:numPr>
+        <w:jc w:val="both"/>
       </w:pPr>
       <w:r>
         <w:t xml:space="preserve">Implementing Recycling of Facts in ADF Pipelines.</w:t>
@@ -4771,6 +4942,7 @@
           <w:ilvl w:val="0"/>
           <w:numId w:val="1016"/>
         </w:numPr>
+        <w:jc w:val="both"/>
       </w:pPr>
       <w:r>
         <w:t xml:space="preserve">Create ADF Pipelines for Dimensions (SCD Types - 2) and Fact Loads</w:t>
@@ -4782,6 +4954,7 @@
           <w:ilvl w:val="0"/>
           <w:numId w:val="1016"/>
         </w:numPr>
+        <w:jc w:val="both"/>
       </w:pPr>
       <w:r>
         <w:t xml:space="preserve">Benchmarked load performance across Azure Data Lake Analytics, Data</w:t>
@@ -4805,6 +4978,7 @@
           <w:ilvl w:val="0"/>
           <w:numId w:val="1016"/>
         </w:numPr>
+        <w:jc w:val="both"/>
       </w:pPr>
       <w:r>
         <w:t xml:space="preserve">Exploring and adopting the best pricing model by analyzing the current</w:t>
@@ -4822,6 +4996,7 @@
           <w:ilvl w:val="0"/>
           <w:numId w:val="1016"/>
         </w:numPr>
+        <w:jc w:val="both"/>
       </w:pPr>
       <w:r>
         <w:t xml:space="preserve">Understand new Data Sources/Data Models and design the enhancements</w:t>
@@ -4839,6 +5014,7 @@
           <w:ilvl w:val="0"/>
           <w:numId w:val="1016"/>
         </w:numPr>
+        <w:jc w:val="both"/>
       </w:pPr>
       <w:r>
         <w:t xml:space="preserve">Integrate new data sources into DWH by involving in</w:t>
@@ -4853,6 +5029,7 @@
     <w:p>
       <w:pPr>
         <w:pStyle w:val="FirstParagraph"/>
+        <w:jc w:val="both"/>
       </w:pPr>
       <w:r>
         <w:rPr>
@@ -4887,6 +5064,7 @@
     <w:p>
       <w:pPr>
         <w:pStyle w:val="BodyText"/>
+        <w:jc w:val="both"/>
       </w:pPr>
       <w:r>
         <w:rPr>
@@ -4911,6 +5089,7 @@
     <w:p>
       <w:pPr>
         <w:pStyle w:val="BodyText"/>
+        <w:jc w:val="both"/>
       </w:pPr>
       <w:r>
         <w:rPr>
@@ -4937,6 +5116,7 @@
     <w:p>
       <w:pPr>
         <w:pStyle w:val="BodyText"/>
+        <w:jc w:val="both"/>
       </w:pPr>
       <w:r>
         <w:rPr>
@@ -4955,6 +5135,7 @@
     <w:p>
       <w:pPr>
         <w:pStyle w:val="BodyText"/>
+        <w:jc w:val="both"/>
       </w:pPr>
       <w:r>
         <w:rPr>
@@ -4973,6 +5154,7 @@
     <w:p>
       <w:pPr>
         <w:pStyle w:val="BodyText"/>
+        <w:jc w:val="both"/>
       </w:pPr>
       <w:r>
         <w:rPr>
@@ -4985,6 +5167,7 @@
     <w:p>
       <w:pPr>
         <w:pStyle w:val="BodyText"/>
+        <w:jc w:val="both"/>
       </w:pPr>
       <w:r>
         <w:t xml:space="preserve">Consolidating different datasets into DWH basically building an</w:t>
@@ -5017,6 +5200,7 @@
     <w:p>
       <w:pPr>
         <w:pStyle w:val="BodyText"/>
+        <w:jc w:val="both"/>
       </w:pPr>
       <w:r>
         <w:rPr>
@@ -5032,6 +5216,7 @@
           <w:ilvl w:val="0"/>
           <w:numId w:val="1017"/>
         </w:numPr>
+        <w:jc w:val="both"/>
       </w:pPr>
       <w:r>
         <w:t xml:space="preserve">Built custom Database Schema Migration tool that auto-generates SSIS</w:t>
@@ -5061,6 +5246,7 @@
           <w:ilvl w:val="0"/>
           <w:numId w:val="1017"/>
         </w:numPr>
+        <w:jc w:val="both"/>
       </w:pPr>
       <w:r>
         <w:t xml:space="preserve">Developed Data Audit Framework that auto-validates and corrects data</w:t>
@@ -5084,6 +5270,7 @@
           <w:ilvl w:val="0"/>
           <w:numId w:val="1017"/>
         </w:numPr>
+        <w:jc w:val="both"/>
       </w:pPr>
       <w:r>
         <w:t xml:space="preserve">Implemented CI/CD automation for SSIS and Azure Data Factory pipelines;</w:t>
@@ -5107,6 +5294,7 @@
           <w:ilvl w:val="0"/>
           <w:numId w:val="1017"/>
         </w:numPr>
+        <w:jc w:val="both"/>
       </w:pPr>
       <w:r>
         <w:t xml:space="preserve">Designed Logical (ER) and Physical data models for star schema;</w:t>
@@ -5130,6 +5318,7 @@
           <w:ilvl w:val="0"/>
           <w:numId w:val="1017"/>
         </w:numPr>
+        <w:jc w:val="both"/>
       </w:pPr>
       <w:r>
         <w:t xml:space="preserve">Integrated 10+ API data sources (Oracle-BRM, Oracle-EBS, Salesforce</w:t>
@@ -5153,6 +5342,7 @@
           <w:ilvl w:val="0"/>
           <w:numId w:val="1017"/>
         </w:numPr>
+        <w:jc w:val="both"/>
       </w:pPr>
       <w:r>
         <w:t xml:space="preserve">Designed and developed Power BI dashboards including geo-spatial</w:t>
@@ -5176,6 +5366,7 @@
           <w:ilvl w:val="0"/>
           <w:numId w:val="1017"/>
         </w:numPr>
+        <w:jc w:val="both"/>
       </w:pPr>
       <w:r>
         <w:t xml:space="preserve">Optimized SSAS cube processing through partition management, AMO</w:t>
@@ -5199,6 +5390,7 @@
           <w:ilvl w:val="0"/>
           <w:numId w:val="1017"/>
         </w:numPr>
+        <w:jc w:val="both"/>
       </w:pPr>
       <w:r>
         <w:t xml:space="preserve">Published SSAS Cube over HTTPS through IIS for SAP BO report</w:t>
@@ -5213,6 +5405,7 @@
     <w:p>
       <w:pPr>
         <w:pStyle w:val="FirstParagraph"/>
+        <w:jc w:val="both"/>
       </w:pPr>
       <w:r>
         <w:rPr>
@@ -5225,6 +5418,7 @@
     <w:p>
       <w:pPr>
         <w:pStyle w:val="BodyText"/>
+        <w:jc w:val="both"/>
       </w:pPr>
       <w:r>
         <w:rPr>
@@ -5259,6 +5453,7 @@
     <w:p>
       <w:pPr>
         <w:pStyle w:val="BodyText"/>
+        <w:jc w:val="both"/>
       </w:pPr>
       <w:r>
         <w:rPr>
@@ -5285,6 +5480,7 @@
     <w:p>
       <w:pPr>
         <w:pStyle w:val="BodyText"/>
+        <w:jc w:val="both"/>
       </w:pPr>
       <w:r>
         <w:rPr>
@@ -5303,6 +5499,7 @@
     <w:p>
       <w:pPr>
         <w:pStyle w:val="BodyText"/>
+        <w:jc w:val="both"/>
       </w:pPr>
       <w:r>
         <w:rPr>
@@ -5315,6 +5512,7 @@
     <w:p>
       <w:pPr>
         <w:pStyle w:val="BodyText"/>
+        <w:jc w:val="both"/>
       </w:pPr>
       <w:r>
         <w:rPr>
@@ -5327,6 +5525,7 @@
     <w:p>
       <w:pPr>
         <w:pStyle w:val="BodyText"/>
+        <w:jc w:val="both"/>
       </w:pPr>
       <w:r>
         <w:t xml:space="preserve">Building Forterra has acquired three organizations each have their own</w:t>
@@ -5371,6 +5570,7 @@
     <w:p>
       <w:pPr>
         <w:pStyle w:val="BodyText"/>
+        <w:jc w:val="both"/>
       </w:pPr>
       <w:r>
         <w:rPr>
@@ -5386,6 +5586,7 @@
           <w:ilvl w:val="0"/>
           <w:numId w:val="1018"/>
         </w:numPr>
+        <w:jc w:val="both"/>
       </w:pPr>
       <w:r>
         <w:t xml:space="preserve">Designed the enterprise data warehouse integrating three acquired</w:t>
@@ -5409,6 +5610,7 @@
           <w:ilvl w:val="0"/>
           <w:numId w:val="1018"/>
         </w:numPr>
+        <w:jc w:val="both"/>
       </w:pPr>
       <w:r>
         <w:t xml:space="preserve">Designed Logical (ER) and Physical data models; developed SSIS ETL</w:t>
@@ -5432,6 +5634,7 @@
           <w:ilvl w:val="0"/>
           <w:numId w:val="1018"/>
         </w:numPr>
+        <w:jc w:val="both"/>
       </w:pPr>
       <w:r>
         <w:t xml:space="preserve">Built SSAS Multidimensional cubes with MDX calculations; optimized</w:t>
@@ -5455,6 +5658,7 @@
           <w:ilvl w:val="0"/>
           <w:numId w:val="1018"/>
         </w:numPr>
+        <w:jc w:val="both"/>
       </w:pPr>
       <w:r>
         <w:t xml:space="preserve">Designed and developed SSRS reports for data loading health monitoring</w:t>
@@ -5478,6 +5682,7 @@
           <w:ilvl w:val="0"/>
           <w:numId w:val="1018"/>
         </w:numPr>
+        <w:jc w:val="both"/>
       </w:pPr>
       <w:r>
         <w:t xml:space="preserve">Created Power BI dashboards for Forterra's main LOB including</w:t>
@@ -5501,6 +5706,7 @@
           <w:ilvl w:val="0"/>
           <w:numId w:val="1018"/>
         </w:numPr>
+        <w:jc w:val="both"/>
       </w:pPr>
       <w:r>
         <w:t xml:space="preserve">Published SSAS Cube over HTTPS through IIS for SAP BO report</w:t>
@@ -5521,6 +5727,7 @@
     <w:p>
       <w:pPr>
         <w:pStyle w:val="FirstParagraph"/>
+        <w:jc w:val="both"/>
       </w:pPr>
       <w:r>
         <w:rPr>
@@ -5533,6 +5740,7 @@
     <w:p>
       <w:pPr>
         <w:pStyle w:val="BodyText"/>
+        <w:jc w:val="both"/>
       </w:pPr>
       <w:r>
         <w:rPr>
@@ -5551,6 +5759,7 @@
     <w:p>
       <w:pPr>
         <w:pStyle w:val="BodyText"/>
+        <w:jc w:val="both"/>
       </w:pPr>
       <w:r>
         <w:rPr>
@@ -5563,6 +5772,7 @@
     <w:p>
       <w:pPr>
         <w:pStyle w:val="BodyText"/>
+        <w:jc w:val="both"/>
       </w:pPr>
       <w:r>
         <w:rPr>
@@ -5581,6 +5791,7 @@
     <w:p>
       <w:pPr>
         <w:pStyle w:val="BodyText"/>
+        <w:jc w:val="both"/>
       </w:pPr>
       <w:r>
         <w:rPr>
@@ -5593,6 +5804,7 @@
     <w:p>
       <w:pPr>
         <w:pStyle w:val="BodyText"/>
+        <w:jc w:val="both"/>
       </w:pPr>
       <w:r>
         <w:t xml:space="preserve">BMS-InterACT is a DWH project which derives data from various data</w:t>
@@ -5631,6 +5843,7 @@
     <w:p>
       <w:pPr>
         <w:pStyle w:val="BodyText"/>
+        <w:jc w:val="both"/>
       </w:pPr>
       <w:r>
         <w:rPr>
@@ -5646,6 +5859,7 @@
           <w:ilvl w:val="0"/>
           <w:numId w:val="1019"/>
         </w:numPr>
+        <w:jc w:val="both"/>
       </w:pPr>
       <w:r>
         <w:t xml:space="preserve">Led the team in requirements gathering, design, coding, and testing;</w:t>
@@ -5663,6 +5877,7 @@
           <w:ilvl w:val="0"/>
           <w:numId w:val="1019"/>
         </w:numPr>
+        <w:jc w:val="both"/>
       </w:pPr>
       <w:r>
         <w:t xml:space="preserve">Designed Logical and Physical data models; built standard SSIS ETL</w:t>
@@ -5686,6 +5901,7 @@
           <w:ilvl w:val="0"/>
           <w:numId w:val="1019"/>
         </w:numPr>
+        <w:jc w:val="both"/>
       </w:pPr>
       <w:r>
         <w:t xml:space="preserve">Built SSAS cubes and SSRS reports for downstream drug sales, growth,</w:t>
@@ -5709,6 +5925,7 @@
           <w:ilvl w:val="0"/>
           <w:numId w:val="1019"/>
         </w:numPr>
+        <w:jc w:val="both"/>
       </w:pPr>
       <w:r>
         <w:t xml:space="preserve">Mentored junior team members through application/technical sessions;</w:t>
@@ -5726,6 +5943,7 @@
           <w:ilvl w:val="0"/>
           <w:numId w:val="1019"/>
         </w:numPr>
+        <w:jc w:val="both"/>
       </w:pPr>
       <w:r>
         <w:t xml:space="preserve">Designed and developed Power BI reports and dashboards (POC) with</w:t>
@@ -5740,6 +5958,7 @@
     <w:p>
       <w:pPr>
         <w:pStyle w:val="FirstParagraph"/>
+        <w:jc w:val="both"/>
       </w:pPr>
       <w:r>
         <w:rPr>
@@ -5758,6 +5977,7 @@
     <w:p>
       <w:pPr>
         <w:pStyle w:val="BodyText"/>
+        <w:jc w:val="both"/>
       </w:pPr>
       <w:r>
         <w:rPr>
@@ -5770,6 +5990,7 @@
     <w:p>
       <w:pPr>
         <w:pStyle w:val="BodyText"/>
+        <w:jc w:val="both"/>
       </w:pPr>
       <w:r>
         <w:rPr>
@@ -5788,6 +6009,7 @@
     <w:p>
       <w:pPr>
         <w:pStyle w:val="BodyText"/>
+        <w:jc w:val="both"/>
       </w:pPr>
       <w:r>
         <w:rPr>
@@ -5800,6 +6022,7 @@
     <w:p>
       <w:pPr>
         <w:pStyle w:val="BodyText"/>
+        <w:jc w:val="both"/>
       </w:pPr>
       <w:r>
         <w:t xml:space="preserve">Concurrently delivered two BI analytics projects at Microsoft: OA 3.0</w:t>
@@ -5826,6 +6049,7 @@
     <w:p>
       <w:pPr>
         <w:pStyle w:val="BodyText"/>
+        <w:jc w:val="both"/>
       </w:pPr>
       <w:r>
         <w:rPr>
@@ -5841,6 +6065,7 @@
           <w:ilvl w:val="0"/>
           <w:numId w:val="1020"/>
         </w:numPr>
+        <w:jc w:val="both"/>
       </w:pPr>
       <w:r>
         <w:t xml:space="preserve">Created and tuned complex SQL queries, stored procedures, views, and</w:t>
@@ -5864,6 +6089,7 @@
           <w:ilvl w:val="0"/>
           <w:numId w:val="1020"/>
         </w:numPr>
+        <w:jc w:val="both"/>
       </w:pPr>
       <w:r>
         <w:t xml:space="preserve">Designed and developed SSRS reports and SSAS cube analytics serving</w:t>
@@ -5881,6 +6107,7 @@
           <w:ilvl w:val="0"/>
           <w:numId w:val="1020"/>
         </w:numPr>
+        <w:jc w:val="both"/>
       </w:pPr>
       <w:r>
         <w:t xml:space="preserve">Implemented cube performance tuning including partitioning strategies,</w:t>
@@ -5898,6 +6125,7 @@
           <w:ilvl w:val="0"/>
           <w:numId w:val="1020"/>
         </w:numPr>
+        <w:jc w:val="both"/>
       </w:pPr>
       <w:r>
         <w:t xml:space="preserve">Created SSIS packages for OLTP-to-OLAP data transfer; developed</w:t>
@@ -5915,6 +6143,7 @@
           <w:ilvl w:val="0"/>
           <w:numId w:val="1020"/>
         </w:numPr>
+        <w:jc w:val="both"/>
       </w:pPr>
       <w:r>
         <w:t xml:space="preserve">Improved SQL Server performance through indexing strategies and table</w:t>
@@ -5932,6 +6161,7 @@
           <w:ilvl w:val="0"/>
           <w:numId w:val="1020"/>
         </w:numPr>
+        <w:jc w:val="both"/>
       </w:pPr>
       <w:r>
         <w:t xml:space="preserve">Developed and executed test strategies, test cases, and validation</w:t>
@@ -5953,6 +6183,7 @@
     <w:p>
       <w:pPr>
         <w:pStyle w:val="FirstParagraph"/>
+        <w:jc w:val="both"/>
       </w:pPr>
       <w:r>
         <w:rPr>
@@ -5965,6 +6196,7 @@
     <w:p>
       <w:pPr>
         <w:pStyle w:val="BodyText"/>
+        <w:jc w:val="both"/>
       </w:pPr>
       <w:r>
         <w:rPr>
@@ -6015,6 +6247,7 @@
     <w:p>
       <w:pPr>
         <w:pStyle w:val="BodyText"/>
+        <w:jc w:val="both"/>
       </w:pPr>
       <w:r>
         <w:rPr>
@@ -6065,6 +6298,7 @@
     <w:p>
       <w:pPr>
         <w:pStyle w:val="BodyText"/>
+        <w:jc w:val="both"/>
       </w:pPr>
       <w:r>
         <w:rPr>
@@ -6115,6 +6349,7 @@
     <w:p>
       <w:pPr>
         <w:pStyle w:val="BodyText"/>
+        <w:jc w:val="both"/>
       </w:pPr>
       <w:r>
         <w:rPr>

</xml_diff>